<commit_message>
Add business model, Free vs Plus and running costs
- Deck: 3 new slides (sustainability model, Free vs Plus proposal,
  monthly running costs chart)
- Docs: new section 8 with funding sources, plan comparison and a cost
  table with sources; headings keep with their content

Co-Authored-By: Claude Opus 5.5 <noreply@anthropic.com>
</commit_message>
<xml_diff>
--- a/deliverables/TruthShift_Documentation.docx
+++ b/deliverables/TruthShift_Documentation.docx
@@ -90,7 +90,7 @@
     <w:sdt>
       <w:sdtPr>
         <w:alias w:val="Contents"/>
-        <w:id w:val="-1283640960"/>
+        <w:id w:val="458606944"/>
       </w:sdtPr>
       <w:sdtEndPr/>
       <w:sdtContent>
@@ -113,7 +113,7 @@
           <w:r>
             <w:fldChar w:fldCharType="separate"/>
           </w:r>
-          <w:hyperlink w:anchor="_Toc242959357" w:history="1">
+          <w:hyperlink w:anchor="_Toc242959981" w:history="1">
             <w:r>
               <w:rPr>
                 <w:rStyle w:val="Hyperlink"/>
@@ -137,7 +137,7 @@
               <w:rPr>
                 <w:noProof/>
               </w:rPr>
-              <w:instrText xml:space="preserve"> PAGEREF _Toc242959357 \h </w:instrText>
+              <w:instrText xml:space="preserve"> PAGEREF _Toc242959981 \h </w:instrText>
             </w:r>
             <w:r>
               <w:rPr>
@@ -174,7 +174,7 @@
               <w:noProof/>
             </w:rPr>
           </w:pPr>
-          <w:hyperlink w:anchor="_Toc242959358" w:history="1">
+          <w:hyperlink w:anchor="_Toc242959982" w:history="1">
             <w:r>
               <w:rPr>
                 <w:rStyle w:val="Hyperlink"/>
@@ -198,7 +198,7 @@
               <w:rPr>
                 <w:noProof/>
               </w:rPr>
-              <w:instrText xml:space="preserve"> PAGEREF _Toc242959358 \h </w:instrText>
+              <w:instrText xml:space="preserve"> PAGEREF _Toc242959982 \h </w:instrText>
             </w:r>
             <w:r>
               <w:rPr>
@@ -235,7 +235,7 @@
               <w:noProof/>
             </w:rPr>
           </w:pPr>
-          <w:hyperlink w:anchor="_Toc242959359" w:history="1">
+          <w:hyperlink w:anchor="_Toc242959983" w:history="1">
             <w:r>
               <w:rPr>
                 <w:rStyle w:val="Hyperlink"/>
@@ -259,7 +259,7 @@
               <w:rPr>
                 <w:noProof/>
               </w:rPr>
-              <w:instrText xml:space="preserve"> PAGEREF _Toc242959359 \h </w:instrText>
+              <w:instrText xml:space="preserve"> PAGEREF _Toc242959983 \h </w:instrText>
             </w:r>
             <w:r>
               <w:rPr>
@@ -296,7 +296,7 @@
               <w:noProof/>
             </w:rPr>
           </w:pPr>
-          <w:hyperlink w:anchor="_Toc242959360" w:history="1">
+          <w:hyperlink w:anchor="_Toc242959984" w:history="1">
             <w:r>
               <w:rPr>
                 <w:rStyle w:val="Hyperlink"/>
@@ -320,7 +320,7 @@
               <w:rPr>
                 <w:noProof/>
               </w:rPr>
-              <w:instrText xml:space="preserve"> PAGEREF _Toc242959360 \h </w:instrText>
+              <w:instrText xml:space="preserve"> PAGEREF _Toc242959984 \h </w:instrText>
             </w:r>
             <w:r>
               <w:rPr>
@@ -357,7 +357,7 @@
               <w:noProof/>
             </w:rPr>
           </w:pPr>
-          <w:hyperlink w:anchor="_Toc242959361" w:history="1">
+          <w:hyperlink w:anchor="_Toc242959985" w:history="1">
             <w:r>
               <w:rPr>
                 <w:rStyle w:val="Hyperlink"/>
@@ -381,7 +381,7 @@
               <w:rPr>
                 <w:noProof/>
               </w:rPr>
-              <w:instrText xml:space="preserve"> PAGEREF _Toc242959361 \h </w:instrText>
+              <w:instrText xml:space="preserve"> PAGEREF _Toc242959985 \h </w:instrText>
             </w:r>
             <w:r>
               <w:rPr>
@@ -418,7 +418,7 @@
               <w:noProof/>
             </w:rPr>
           </w:pPr>
-          <w:hyperlink w:anchor="_Toc242959362" w:history="1">
+          <w:hyperlink w:anchor="_Toc242959986" w:history="1">
             <w:r>
               <w:rPr>
                 <w:rStyle w:val="Hyperlink"/>
@@ -442,7 +442,7 @@
               <w:rPr>
                 <w:noProof/>
               </w:rPr>
-              <w:instrText xml:space="preserve"> PAGEREF _Toc242959362 \h </w:instrText>
+              <w:instrText xml:space="preserve"> PAGEREF _Toc242959986 \h </w:instrText>
             </w:r>
             <w:r>
               <w:rPr>
@@ -479,7 +479,7 @@
               <w:noProof/>
             </w:rPr>
           </w:pPr>
-          <w:hyperlink w:anchor="_Toc242959363" w:history="1">
+          <w:hyperlink w:anchor="_Toc242959987" w:history="1">
             <w:r>
               <w:rPr>
                 <w:rStyle w:val="Hyperlink"/>
@@ -503,7 +503,7 @@
               <w:rPr>
                 <w:noProof/>
               </w:rPr>
-              <w:instrText xml:space="preserve"> PAGEREF _Toc242959363 \h </w:instrText>
+              <w:instrText xml:space="preserve"> PAGEREF _Toc242959987 \h </w:instrText>
             </w:r>
             <w:r>
               <w:rPr>
@@ -540,7 +540,7 @@
               <w:noProof/>
             </w:rPr>
           </w:pPr>
-          <w:hyperlink w:anchor="_Toc242959364" w:history="1">
+          <w:hyperlink w:anchor="_Toc242959988" w:history="1">
             <w:r>
               <w:rPr>
                 <w:rStyle w:val="Hyperlink"/>
@@ -564,7 +564,7 @@
               <w:rPr>
                 <w:noProof/>
               </w:rPr>
-              <w:instrText xml:space="preserve"> PAGEREF _Toc242959364 \h </w:instrText>
+              <w:instrText xml:space="preserve"> PAGEREF _Toc242959988 \h </w:instrText>
             </w:r>
             <w:r>
               <w:rPr>
@@ -601,7 +601,7 @@
               <w:noProof/>
             </w:rPr>
           </w:pPr>
-          <w:hyperlink w:anchor="_Toc242959365" w:history="1">
+          <w:hyperlink w:anchor="_Toc242959989" w:history="1">
             <w:r>
               <w:rPr>
                 <w:rStyle w:val="Hyperlink"/>
@@ -625,7 +625,7 @@
               <w:rPr>
                 <w:noProof/>
               </w:rPr>
-              <w:instrText xml:space="preserve"> PAGEREF _Toc242959365 \h </w:instrText>
+              <w:instrText xml:space="preserve"> PAGEREF _Toc242959989 \h </w:instrText>
             </w:r>
             <w:r>
               <w:rPr>
@@ -662,13 +662,13 @@
               <w:noProof/>
             </w:rPr>
           </w:pPr>
-          <w:hyperlink w:anchor="_Toc242959366" w:history="1">
+          <w:hyperlink w:anchor="_Toc242959990" w:history="1">
             <w:r>
               <w:rPr>
                 <w:rStyle w:val="Hyperlink"/>
                 <w:noProof/>
               </w:rPr>
-              <w:t>8. Limitations and future work</w:t>
+              <w:t>8. Business model and running costs</w:t>
             </w:r>
             <w:r>
               <w:rPr>
@@ -686,7 +686,7 @@
               <w:rPr>
                 <w:noProof/>
               </w:rPr>
-              <w:instrText xml:space="preserve"> PAGEREF _Toc242959366 \h </w:instrText>
+              <w:instrText xml:space="preserve"> PAGEREF _Toc242959990 \h </w:instrText>
             </w:r>
             <w:r>
               <w:rPr>
@@ -723,12 +723,256 @@
               <w:noProof/>
             </w:rPr>
           </w:pPr>
-          <w:hyperlink w:anchor="_Toc242959367" w:history="1">
+          <w:hyperlink w:anchor="_Toc242959991" w:history="1">
             <w:r>
               <w:rPr>
                 <w:rStyle w:val="Hyperlink"/>
                 <w:noProof/>
               </w:rPr>
+              <w:t>How it is paid for</w:t>
+            </w:r>
+            <w:r>
+              <w:rPr>
+                <w:noProof/>
+              </w:rPr>
+              <w:tab/>
+            </w:r>
+            <w:r>
+              <w:rPr>
+                <w:noProof/>
+              </w:rPr>
+              <w:fldChar w:fldCharType="begin"/>
+            </w:r>
+            <w:r>
+              <w:rPr>
+                <w:noProof/>
+              </w:rPr>
+              <w:instrText xml:space="preserve"> PAGEREF _Toc242959991 \h </w:instrText>
+            </w:r>
+            <w:r>
+              <w:rPr>
+                <w:noProof/>
+              </w:rPr>
+            </w:r>
+            <w:r>
+              <w:rPr>
+                <w:noProof/>
+              </w:rPr>
+              <w:fldChar w:fldCharType="separate"/>
+            </w:r>
+            <w:r>
+              <w:rPr>
+                <w:noProof/>
+              </w:rPr>
+              <w:t>8</w:t>
+            </w:r>
+            <w:r>
+              <w:rPr>
+                <w:noProof/>
+              </w:rPr>
+              <w:fldChar w:fldCharType="end"/>
+            </w:r>
+          </w:hyperlink>
+        </w:p>
+        <w:p>
+          <w:pPr>
+            <w:pStyle w:val="TOC2"/>
+            <w:tabs>
+              <w:tab w:val="right" w:leader="dot" w:pos="9350"/>
+            </w:tabs>
+            <w:rPr>
+              <w:noProof/>
+            </w:rPr>
+          </w:pPr>
+          <w:hyperlink w:anchor="_Toc242959992" w:history="1">
+            <w:r>
+              <w:rPr>
+                <w:rStyle w:val="Hyperlink"/>
+                <w:noProof/>
+              </w:rPr>
+              <w:t>Free vs Plus (proposal)</w:t>
+            </w:r>
+            <w:r>
+              <w:rPr>
+                <w:noProof/>
+              </w:rPr>
+              <w:tab/>
+            </w:r>
+            <w:r>
+              <w:rPr>
+                <w:noProof/>
+              </w:rPr>
+              <w:fldChar w:fldCharType="begin"/>
+            </w:r>
+            <w:r>
+              <w:rPr>
+                <w:noProof/>
+              </w:rPr>
+              <w:instrText xml:space="preserve"> PAGEREF _Toc242959992 \h </w:instrText>
+            </w:r>
+            <w:r>
+              <w:rPr>
+                <w:noProof/>
+              </w:rPr>
+            </w:r>
+            <w:r>
+              <w:rPr>
+                <w:noProof/>
+              </w:rPr>
+              <w:fldChar w:fldCharType="separate"/>
+            </w:r>
+            <w:r>
+              <w:rPr>
+                <w:noProof/>
+              </w:rPr>
+              <w:t>8</w:t>
+            </w:r>
+            <w:r>
+              <w:rPr>
+                <w:noProof/>
+              </w:rPr>
+              <w:fldChar w:fldCharType="end"/>
+            </w:r>
+          </w:hyperlink>
+        </w:p>
+        <w:p>
+          <w:pPr>
+            <w:pStyle w:val="TOC2"/>
+            <w:tabs>
+              <w:tab w:val="right" w:leader="dot" w:pos="9350"/>
+            </w:tabs>
+            <w:rPr>
+              <w:noProof/>
+            </w:rPr>
+          </w:pPr>
+          <w:hyperlink w:anchor="_Toc242959993" w:history="1">
+            <w:r>
+              <w:rPr>
+                <w:rStyle w:val="Hyperlink"/>
+                <w:noProof/>
+              </w:rPr>
+              <w:t>Running costs (USD per month, October 2026)</w:t>
+            </w:r>
+            <w:r>
+              <w:rPr>
+                <w:noProof/>
+              </w:rPr>
+              <w:tab/>
+            </w:r>
+            <w:r>
+              <w:rPr>
+                <w:noProof/>
+              </w:rPr>
+              <w:fldChar w:fldCharType="begin"/>
+            </w:r>
+            <w:r>
+              <w:rPr>
+                <w:noProof/>
+              </w:rPr>
+              <w:instrText xml:space="preserve"> PAGEREF _Toc242959993 \h </w:instrText>
+            </w:r>
+            <w:r>
+              <w:rPr>
+                <w:noProof/>
+              </w:rPr>
+            </w:r>
+            <w:r>
+              <w:rPr>
+                <w:noProof/>
+              </w:rPr>
+              <w:fldChar w:fldCharType="separate"/>
+            </w:r>
+            <w:r>
+              <w:rPr>
+                <w:noProof/>
+              </w:rPr>
+              <w:t>8</w:t>
+            </w:r>
+            <w:r>
+              <w:rPr>
+                <w:noProof/>
+              </w:rPr>
+              <w:fldChar w:fldCharType="end"/>
+            </w:r>
+          </w:hyperlink>
+        </w:p>
+        <w:p>
+          <w:pPr>
+            <w:pStyle w:val="TOC1"/>
+            <w:tabs>
+              <w:tab w:val="right" w:leader="dot" w:pos="9350"/>
+            </w:tabs>
+            <w:rPr>
+              <w:noProof/>
+            </w:rPr>
+          </w:pPr>
+          <w:hyperlink w:anchor="_Toc242959994" w:history="1">
+            <w:r>
+              <w:rPr>
+                <w:rStyle w:val="Hyperlink"/>
+                <w:noProof/>
+              </w:rPr>
+              <w:t>9. Limitations and future work</w:t>
+            </w:r>
+            <w:r>
+              <w:rPr>
+                <w:noProof/>
+              </w:rPr>
+              <w:tab/>
+            </w:r>
+            <w:r>
+              <w:rPr>
+                <w:noProof/>
+              </w:rPr>
+              <w:fldChar w:fldCharType="begin"/>
+            </w:r>
+            <w:r>
+              <w:rPr>
+                <w:noProof/>
+              </w:rPr>
+              <w:instrText xml:space="preserve"> PAGEREF _Toc242959994 \h </w:instrText>
+            </w:r>
+            <w:r>
+              <w:rPr>
+                <w:noProof/>
+              </w:rPr>
+            </w:r>
+            <w:r>
+              <w:rPr>
+                <w:noProof/>
+              </w:rPr>
+              <w:fldChar w:fldCharType="separate"/>
+            </w:r>
+            <w:r>
+              <w:rPr>
+                <w:noProof/>
+              </w:rPr>
+              <w:t>9</w:t>
+            </w:r>
+            <w:r>
+              <w:rPr>
+                <w:noProof/>
+              </w:rPr>
+              <w:fldChar w:fldCharType="end"/>
+            </w:r>
+          </w:hyperlink>
+        </w:p>
+        <w:p>
+          <w:pPr>
+            <w:pStyle w:val="TOC2"/>
+            <w:tabs>
+              <w:tab w:val="right" w:leader="dot" w:pos="9350"/>
+            </w:tabs>
+            <w:rPr>
+              <w:noProof/>
+            </w:rPr>
+          </w:pPr>
+          <w:hyperlink w:anchor="_Toc242959995" w:history="1">
+            <w:r>
+              <w:rPr>
+                <w:rStyle w:val="Hyperlink"/>
+                <w:noProof/>
+              </w:rPr>
               <w:t>Next steps</w:t>
             </w:r>
             <w:r>
@@ -747,7 +991,7 @@
               <w:rPr>
                 <w:noProof/>
               </w:rPr>
-              <w:instrText xml:space="preserve"> PAGEREF _Toc242959367 \h </w:instrText>
+              <w:instrText xml:space="preserve"> PAGEREF _Toc242959995 \h </w:instrText>
             </w:r>
             <w:r>
               <w:rPr>
@@ -764,7 +1008,7 @@
               <w:rPr>
                 <w:noProof/>
               </w:rPr>
-              <w:t>8</w:t>
+              <w:t>9</w:t>
             </w:r>
             <w:r>
               <w:rPr>
@@ -789,8 +1033,9 @@
     <w:p>
       <w:pPr>
         <w:pStyle w:val="Heading1"/>
-      </w:pPr>
-      <w:bookmarkStart w:id="0" w:name="_Toc242959357"/>
+        <w:keepNext/>
+      </w:pPr>
+      <w:bookmarkStart w:id="0" w:name="_Toc242959981"/>
       <w:r>
         <w:t>1. Overview</w:t>
       </w:r>
@@ -837,8 +1082,9 @@
     <w:p>
       <w:pPr>
         <w:pStyle w:val="Heading1"/>
-      </w:pPr>
-      <w:bookmarkStart w:id="1" w:name="_Toc242959358"/>
+        <w:keepNext/>
+      </w:pPr>
+      <w:bookmarkStart w:id="1" w:name="_Toc242959982"/>
       <w:r>
         <w:t>2. Features</w:t>
       </w:r>
@@ -1396,8 +1642,9 @@
     <w:p>
       <w:pPr>
         <w:pStyle w:val="Heading1"/>
-      </w:pPr>
-      <w:bookmarkStart w:id="2" w:name="_Toc242959359"/>
+        <w:keepNext/>
+      </w:pPr>
+      <w:bookmarkStart w:id="2" w:name="_Toc242959983"/>
       <w:r>
         <w:t>3. Tech stack</w:t>
       </w:r>
@@ -2084,8 +2331,9 @@
     <w:p>
       <w:pPr>
         <w:pStyle w:val="Heading1"/>
-      </w:pPr>
-      <w:bookmarkStart w:id="3" w:name="_Toc242959360"/>
+        <w:keepNext/>
+      </w:pPr>
+      <w:bookmarkStart w:id="3" w:name="_Toc242959984"/>
       <w:r>
         <w:t>4. Architecture</w:t>
       </w:r>
@@ -2109,7 +2357,7 @@
           <w:noProof/>
         </w:rPr>
         <w:drawing>
-          <wp:inline distT="0" distB="0" distL="0" distR="0" wp14:anchorId="144C7587" wp14:editId="5445870C">
+          <wp:inline distT="0" distB="0" distL="0" distR="0" wp14:anchorId="6FDD9E59" wp14:editId="2410A04A">
             <wp:extent cx="5715000" cy="3133725"/>
             <wp:effectExtent l="0" t="0" r="0" b="0"/>
             <wp:docPr id="1" name="Architecture diagram: React frontend calls the FastAPI backend, which reads the JSON dataset and calls Open Food Facts and the Claude API; map tiles load from OpenStreetMap into the browser" descr="Architecture diagram: React frontend calls the FastAPI backend, which reads the JSON dataset and calls Open Food Facts and the Claude API; map tiles load from OpenStreetMap into the browser" title="Architecture diagram: React frontend calls the FastAPI backend, which reads the JSON dataset and calls Open Food Facts and the Claude API; map tiles load from OpenStreetMap into the browser"/>
@@ -2774,8 +3022,9 @@
     <w:p>
       <w:pPr>
         <w:pStyle w:val="Heading1"/>
-      </w:pPr>
-      <w:bookmarkStart w:id="4" w:name="_Toc242959361"/>
+        <w:keepNext/>
+      </w:pPr>
+      <w:bookmarkStart w:id="4" w:name="_Toc242959985"/>
       <w:r>
         <w:t>5. Scoring method</w:t>
       </w:r>
@@ -3351,8 +3600,9 @@
     <w:p>
       <w:pPr>
         <w:pStyle w:val="Heading1"/>
-      </w:pPr>
-      <w:bookmarkStart w:id="5" w:name="_Toc242959362"/>
+        <w:keepNext/>
+      </w:pPr>
+      <w:bookmarkStart w:id="5" w:name="_Toc242959986"/>
       <w:r>
         <w:t>6. Datasets</w:t>
       </w:r>
@@ -4252,7 +4502,7 @@
           <w:noProof/>
         </w:rPr>
         <w:drawing>
-          <wp:inline distT="0" distB="0" distL="0" distR="0" wp14:anchorId="0A5AAA62" wp14:editId="53472EF8">
+          <wp:inline distT="0" distB="0" distL="0" distR="0" wp14:anchorId="2CE1F659" wp14:editId="73B48866">
             <wp:extent cx="5715000" cy="3057525"/>
             <wp:effectExtent l="0" t="0" r="0" b="0"/>
             <wp:docPr id="2" name="Bar chart: share of products with a known fact by factor. Demo products: Buy Canadian 89%, fair trade 50%, animal welfare 73%, environment 65%, packaging 100%. Real products: 6%, 0%, 8%, 85%, 3%" descr="Bar chart: share of products with a known fact by factor. Demo products: Buy Canadian 89%, fair trade 50%, animal welfare 73%, environment 65%, packaging 100%. Real products: 6%, 0%, 8%, 85%, 3%" title="Bar chart: share of products with a known fact by factor. Demo products: Buy Canadian 89%, fair trade 50%, animal welfare 73%, environment 65%, packaging 100%. Real products: 6%, 0%, 8%, 85%, 3%"/>
@@ -4326,8 +4576,9 @@
     <w:p>
       <w:pPr>
         <w:pStyle w:val="Heading1"/>
-      </w:pPr>
-      <w:bookmarkStart w:id="6" w:name="_Toc242959363"/>
+        <w:keepNext/>
+      </w:pPr>
+      <w:bookmarkStart w:id="6" w:name="_Toc242959987"/>
       <w:r>
         <w:t>7. How to run and customize</w:t>
       </w:r>
@@ -4344,8 +4595,9 @@
     <w:p>
       <w:pPr>
         <w:pStyle w:val="Heading2"/>
-      </w:pPr>
-      <w:bookmarkStart w:id="7" w:name="_Toc242959364"/>
+        <w:keepNext/>
+      </w:pPr>
+      <w:bookmarkStart w:id="7" w:name="_Toc242959988"/>
       <w:r>
         <w:t>Backend (API on http://localhost:8000, docs at /docs)</w:t>
       </w:r>
@@ -4397,8 +4649,9 @@
     <w:p>
       <w:pPr>
         <w:pStyle w:val="Heading2"/>
-      </w:pPr>
-      <w:bookmarkStart w:id="8" w:name="_Toc242959365"/>
+        <w:keepNext/>
+      </w:pPr>
+      <w:bookmarkStart w:id="8" w:name="_Toc242959989"/>
       <w:r>
         <w:t>Frontend (app on http://localhost:5173)</w:t>
       </w:r>
@@ -5081,12 +5334,1298 @@
     <w:p>
       <w:pPr>
         <w:pStyle w:val="Heading1"/>
-      </w:pPr>
-      <w:bookmarkStart w:id="9" w:name="_Toc242959366"/>
-      <w:r>
-        <w:t>8. Limitations and future work</w:t>
+        <w:keepNext/>
+      </w:pPr>
+      <w:bookmarkStart w:id="9" w:name="_Toc242959990"/>
+      <w:r>
+        <w:t>8. Business model and running costs</w:t>
       </w:r>
       <w:bookmarkEnd w:id="9"/>
+    </w:p>
+    <w:p>
+      <w:pPr>
+        <w:spacing w:after="140"/>
+      </w:pPr>
+      <w:r>
+        <w:t xml:space="preserve">TruthShift stays free for every shopper, because its main users are newcomers on tight budgets. One rule protects the app’s purpose: </w:t>
+      </w:r>
+      <w:r>
+        <w:rPr>
+          <w:b/>
+          <w:bCs/>
+        </w:rPr>
+        <w:t>money never changes a score</w:t>
+      </w:r>
+      <w:r>
+        <w:t>. Only evidence does.</w:t>
+      </w:r>
+    </w:p>
+    <w:p>
+      <w:pPr>
+        <w:pStyle w:val="Heading2"/>
+        <w:keepNext/>
+      </w:pPr>
+      <w:bookmarkStart w:id="10" w:name="_Toc242959991"/>
+      <w:r>
+        <w:t>How it is paid for</w:t>
+      </w:r>
+      <w:bookmarkEnd w:id="10"/>
+    </w:p>
+    <w:tbl>
+      <w:tblPr>
+        <w:tblW w:w="9360" w:type="dxa"/>
+        <w:tblBorders>
+          <w:top w:val="single" w:sz="4" w:space="0" w:color="auto"/>
+          <w:left w:val="single" w:sz="4" w:space="0" w:color="auto"/>
+          <w:bottom w:val="single" w:sz="4" w:space="0" w:color="auto"/>
+          <w:right w:val="single" w:sz="4" w:space="0" w:color="auto"/>
+          <w:insideH w:val="single" w:sz="4" w:space="0" w:color="auto"/>
+          <w:insideV w:val="single" w:sz="4" w:space="0" w:color="auto"/>
+        </w:tblBorders>
+        <w:tblLook w:val="04A0" w:firstRow="1" w:lastRow="0" w:firstColumn="1" w:lastColumn="0" w:noHBand="0" w:noVBand="1"/>
+      </w:tblPr>
+      <w:tblGrid>
+        <w:gridCol w:w="2200"/>
+        <w:gridCol w:w="3100"/>
+        <w:gridCol w:w="4060"/>
+      </w:tblGrid>
+      <w:tr>
+        <w:trPr>
+          <w:tblHeader/>
+        </w:trPr>
+        <w:tc>
+          <w:tcPr>
+            <w:tcW w:w="2200" w:type="dxa"/>
+            <w:tcBorders>
+              <w:top w:val="single" w:sz="4" w:space="0" w:color="D9E0DA"/>
+              <w:left w:val="single" w:sz="4" w:space="0" w:color="D9E0DA"/>
+              <w:bottom w:val="single" w:sz="4" w:space="0" w:color="D9E0DA"/>
+              <w:right w:val="single" w:sz="4" w:space="0" w:color="D9E0DA"/>
+            </w:tcBorders>
+            <w:shd w:val="clear" w:color="auto" w:fill="14302A"/>
+            <w:tcMar>
+              <w:top w:w="60" w:type="dxa"/>
+              <w:left w:w="100" w:type="dxa"/>
+              <w:bottom w:w="60" w:type="dxa"/>
+              <w:right w:w="100" w:type="dxa"/>
+            </w:tcMar>
+          </w:tcPr>
+          <w:p>
+            <w:r>
+              <w:rPr>
+                <w:b/>
+                <w:bCs/>
+                <w:color w:val="FFFFFF"/>
+                <w:sz w:val="20"/>
+                <w:szCs w:val="20"/>
+              </w:rPr>
+              <w:t>Source</w:t>
+            </w:r>
+          </w:p>
+        </w:tc>
+        <w:tc>
+          <w:tcPr>
+            <w:tcW w:w="3100" w:type="dxa"/>
+            <w:tcBorders>
+              <w:top w:val="single" w:sz="4" w:space="0" w:color="D9E0DA"/>
+              <w:left w:val="single" w:sz="4" w:space="0" w:color="D9E0DA"/>
+              <w:bottom w:val="single" w:sz="4" w:space="0" w:color="D9E0DA"/>
+              <w:right w:val="single" w:sz="4" w:space="0" w:color="D9E0DA"/>
+            </w:tcBorders>
+            <w:shd w:val="clear" w:color="auto" w:fill="14302A"/>
+            <w:tcMar>
+              <w:top w:w="60" w:type="dxa"/>
+              <w:left w:w="100" w:type="dxa"/>
+              <w:bottom w:w="60" w:type="dxa"/>
+              <w:right w:w="100" w:type="dxa"/>
+            </w:tcMar>
+          </w:tcPr>
+          <w:p>
+            <w:r>
+              <w:rPr>
+                <w:b/>
+                <w:bCs/>
+                <w:color w:val="FFFFFF"/>
+                <w:sz w:val="20"/>
+                <w:szCs w:val="20"/>
+              </w:rPr>
+              <w:t>Who pays</w:t>
+            </w:r>
+          </w:p>
+        </w:tc>
+        <w:tc>
+          <w:tcPr>
+            <w:tcW w:w="4060" w:type="dxa"/>
+            <w:tcBorders>
+              <w:top w:val="single" w:sz="4" w:space="0" w:color="D9E0DA"/>
+              <w:left w:val="single" w:sz="4" w:space="0" w:color="D9E0DA"/>
+              <w:bottom w:val="single" w:sz="4" w:space="0" w:color="D9E0DA"/>
+              <w:right w:val="single" w:sz="4" w:space="0" w:color="D9E0DA"/>
+            </w:tcBorders>
+            <w:shd w:val="clear" w:color="auto" w:fill="14302A"/>
+            <w:tcMar>
+              <w:top w:w="60" w:type="dxa"/>
+              <w:left w:w="100" w:type="dxa"/>
+              <w:bottom w:w="60" w:type="dxa"/>
+              <w:right w:w="100" w:type="dxa"/>
+            </w:tcMar>
+          </w:tcPr>
+          <w:p>
+            <w:r>
+              <w:rPr>
+                <w:b/>
+                <w:bCs/>
+                <w:color w:val="FFFFFF"/>
+                <w:sz w:val="20"/>
+                <w:szCs w:val="20"/>
+              </w:rPr>
+              <w:t>How it works</w:t>
+            </w:r>
+          </w:p>
+        </w:tc>
+      </w:tr>
+      <w:tr>
+        <w:tc>
+          <w:tcPr>
+            <w:tcW w:w="2200" w:type="dxa"/>
+            <w:tcBorders>
+              <w:top w:val="single" w:sz="4" w:space="0" w:color="D9E0DA"/>
+              <w:left w:val="single" w:sz="4" w:space="0" w:color="D9E0DA"/>
+              <w:bottom w:val="single" w:sz="4" w:space="0" w:color="D9E0DA"/>
+              <w:right w:val="single" w:sz="4" w:space="0" w:color="D9E0DA"/>
+            </w:tcBorders>
+            <w:tcMar>
+              <w:top w:w="60" w:type="dxa"/>
+              <w:left w:w="100" w:type="dxa"/>
+              <w:bottom w:w="60" w:type="dxa"/>
+              <w:right w:w="100" w:type="dxa"/>
+            </w:tcMar>
+          </w:tcPr>
+          <w:p>
+            <w:r>
+              <w:t>Grants</w:t>
+            </w:r>
+          </w:p>
+        </w:tc>
+        <w:tc>
+          <w:tcPr>
+            <w:tcW w:w="3100" w:type="dxa"/>
+            <w:tcBorders>
+              <w:top w:val="single" w:sz="4" w:space="0" w:color="D9E0DA"/>
+              <w:left w:val="single" w:sz="4" w:space="0" w:color="D9E0DA"/>
+              <w:bottom w:val="single" w:sz="4" w:space="0" w:color="D9E0DA"/>
+              <w:right w:val="single" w:sz="4" w:space="0" w:color="D9E0DA"/>
+            </w:tcBorders>
+            <w:tcMar>
+              <w:top w:w="60" w:type="dxa"/>
+              <w:left w:w="100" w:type="dxa"/>
+              <w:bottom w:w="60" w:type="dxa"/>
+              <w:right w:w="100" w:type="dxa"/>
+            </w:tcMar>
+          </w:tcPr>
+          <w:p>
+            <w:r>
+              <w:t>Settlement agencies, City of Regina, community foundations</w:t>
+            </w:r>
+          </w:p>
+        </w:tc>
+        <w:tc>
+          <w:tcPr>
+            <w:tcW w:w="4060" w:type="dxa"/>
+            <w:tcBorders>
+              <w:top w:val="single" w:sz="4" w:space="0" w:color="D9E0DA"/>
+              <w:left w:val="single" w:sz="4" w:space="0" w:color="D9E0DA"/>
+              <w:bottom w:val="single" w:sz="4" w:space="0" w:color="D9E0DA"/>
+              <w:right w:val="single" w:sz="4" w:space="0" w:color="D9E0DA"/>
+            </w:tcBorders>
+            <w:tcMar>
+              <w:top w:w="60" w:type="dxa"/>
+              <w:left w:w="100" w:type="dxa"/>
+              <w:bottom w:w="60" w:type="dxa"/>
+              <w:right w:w="100" w:type="dxa"/>
+            </w:tcMar>
+          </w:tcPr>
+          <w:p>
+            <w:r>
+              <w:t>The app supports newcomer integration and local business, which matches their funding goals</w:t>
+            </w:r>
+          </w:p>
+        </w:tc>
+      </w:tr>
+      <w:tr>
+        <w:tc>
+          <w:tcPr>
+            <w:tcW w:w="2200" w:type="dxa"/>
+            <w:tcBorders>
+              <w:top w:val="single" w:sz="4" w:space="0" w:color="D9E0DA"/>
+              <w:left w:val="single" w:sz="4" w:space="0" w:color="D9E0DA"/>
+              <w:bottom w:val="single" w:sz="4" w:space="0" w:color="D9E0DA"/>
+              <w:right w:val="single" w:sz="4" w:space="0" w:color="D9E0DA"/>
+            </w:tcBorders>
+            <w:shd w:val="clear" w:color="auto" w:fill="F7F9F7"/>
+            <w:tcMar>
+              <w:top w:w="60" w:type="dxa"/>
+              <w:left w:w="100" w:type="dxa"/>
+              <w:bottom w:w="60" w:type="dxa"/>
+              <w:right w:w="100" w:type="dxa"/>
+            </w:tcMar>
+          </w:tcPr>
+          <w:p>
+            <w:r>
+              <w:t>Verified listings</w:t>
+            </w:r>
+          </w:p>
+        </w:tc>
+        <w:tc>
+          <w:tcPr>
+            <w:tcW w:w="3100" w:type="dxa"/>
+            <w:tcBorders>
+              <w:top w:val="single" w:sz="4" w:space="0" w:color="D9E0DA"/>
+              <w:left w:val="single" w:sz="4" w:space="0" w:color="D9E0DA"/>
+              <w:bottom w:val="single" w:sz="4" w:space="0" w:color="D9E0DA"/>
+              <w:right w:val="single" w:sz="4" w:space="0" w:color="D9E0DA"/>
+            </w:tcBorders>
+            <w:shd w:val="clear" w:color="auto" w:fill="F7F9F7"/>
+            <w:tcMar>
+              <w:top w:w="60" w:type="dxa"/>
+              <w:left w:w="100" w:type="dxa"/>
+              <w:bottom w:w="60" w:type="dxa"/>
+              <w:right w:w="100" w:type="dxa"/>
+            </w:tcMar>
+          </w:tcPr>
+          <w:p>
+            <w:r>
+              <w:t>Local Regina businesses</w:t>
+            </w:r>
+          </w:p>
+        </w:tc>
+        <w:tc>
+          <w:tcPr>
+            <w:tcW w:w="4060" w:type="dxa"/>
+            <w:tcBorders>
+              <w:top w:val="single" w:sz="4" w:space="0" w:color="D9E0DA"/>
+              <w:left w:val="single" w:sz="4" w:space="0" w:color="D9E0DA"/>
+              <w:bottom w:val="single" w:sz="4" w:space="0" w:color="D9E0DA"/>
+              <w:right w:val="single" w:sz="4" w:space="0" w:color="D9E0DA"/>
+            </w:tcBorders>
+            <w:shd w:val="clear" w:color="auto" w:fill="F7F9F7"/>
+            <w:tcMar>
+              <w:top w:w="60" w:type="dxa"/>
+              <w:left w:w="100" w:type="dxa"/>
+              <w:bottom w:w="60" w:type="dxa"/>
+              <w:right w:w="100" w:type="dxa"/>
+            </w:tcMar>
+          </w:tcPr>
+          <w:p>
+            <w:r>
+              <w:t>A business pays to have its claims checked (ownership, certifications). If the evidence holds, the fact changes from Claimed to Verified. Paying never raises a score.</w:t>
+            </w:r>
+          </w:p>
+        </w:tc>
+      </w:tr>
+      <w:tr>
+        <w:tc>
+          <w:tcPr>
+            <w:tcW w:w="2200" w:type="dxa"/>
+            <w:tcBorders>
+              <w:top w:val="single" w:sz="4" w:space="0" w:color="D9E0DA"/>
+              <w:left w:val="single" w:sz="4" w:space="0" w:color="D9E0DA"/>
+              <w:bottom w:val="single" w:sz="4" w:space="0" w:color="D9E0DA"/>
+              <w:right w:val="single" w:sz="4" w:space="0" w:color="D9E0DA"/>
+            </w:tcBorders>
+            <w:tcMar>
+              <w:top w:w="60" w:type="dxa"/>
+              <w:left w:w="100" w:type="dxa"/>
+              <w:bottom w:w="60" w:type="dxa"/>
+              <w:right w:w="100" w:type="dxa"/>
+            </w:tcMar>
+          </w:tcPr>
+          <w:p>
+            <w:r>
+              <w:t>TruthShift Plus (future)</w:t>
+            </w:r>
+          </w:p>
+        </w:tc>
+        <w:tc>
+          <w:tcPr>
+            <w:tcW w:w="3100" w:type="dxa"/>
+            <w:tcBorders>
+              <w:top w:val="single" w:sz="4" w:space="0" w:color="D9E0DA"/>
+              <w:left w:val="single" w:sz="4" w:space="0" w:color="D9E0DA"/>
+              <w:bottom w:val="single" w:sz="4" w:space="0" w:color="D9E0DA"/>
+              <w:right w:val="single" w:sz="4" w:space="0" w:color="D9E0DA"/>
+            </w:tcBorders>
+            <w:tcMar>
+              <w:top w:w="60" w:type="dxa"/>
+              <w:left w:w="100" w:type="dxa"/>
+              <w:bottom w:w="60" w:type="dxa"/>
+              <w:right w:w="100" w:type="dxa"/>
+            </w:tcMar>
+          </w:tcPr>
+          <w:p>
+            <w:r>
+              <w:t>Shoppers who want extra features</w:t>
+            </w:r>
+          </w:p>
+        </w:tc>
+        <w:tc>
+          <w:tcPr>
+            <w:tcW w:w="4060" w:type="dxa"/>
+            <w:tcBorders>
+              <w:top w:val="single" w:sz="4" w:space="0" w:color="D9E0DA"/>
+              <w:left w:val="single" w:sz="4" w:space="0" w:color="D9E0DA"/>
+              <w:bottom w:val="single" w:sz="4" w:space="0" w:color="D9E0DA"/>
+              <w:right w:val="single" w:sz="4" w:space="0" w:color="D9E0DA"/>
+            </w:tcBorders>
+            <w:tcMar>
+              <w:top w:w="60" w:type="dxa"/>
+              <w:left w:w="100" w:type="dxa"/>
+              <w:bottom w:w="60" w:type="dxa"/>
+              <w:right w:w="100" w:type="dxa"/>
+            </w:tcMar>
+          </w:tcPr>
+          <w:p>
+            <w:r>
+              <w:t>Optional subscription, proposed at about $3 a month; free for RODS clients through a sponsorship</w:t>
+            </w:r>
+          </w:p>
+        </w:tc>
+      </w:tr>
+    </w:tbl>
+    <w:p>
+      <w:pPr>
+        <w:pStyle w:val="Heading2"/>
+        <w:keepNext/>
+      </w:pPr>
+      <w:bookmarkStart w:id="11" w:name="_Toc242959992"/>
+      <w:r>
+        <w:t>Free vs Plus (proposal)</w:t>
+      </w:r>
+      <w:bookmarkEnd w:id="11"/>
+    </w:p>
+    <w:tbl>
+      <w:tblPr>
+        <w:tblW w:w="9360" w:type="dxa"/>
+        <w:tblBorders>
+          <w:top w:val="single" w:sz="4" w:space="0" w:color="auto"/>
+          <w:left w:val="single" w:sz="4" w:space="0" w:color="auto"/>
+          <w:bottom w:val="single" w:sz="4" w:space="0" w:color="auto"/>
+          <w:right w:val="single" w:sz="4" w:space="0" w:color="auto"/>
+          <w:insideH w:val="single" w:sz="4" w:space="0" w:color="auto"/>
+          <w:insideV w:val="single" w:sz="4" w:space="0" w:color="auto"/>
+        </w:tblBorders>
+        <w:tblLook w:val="04A0" w:firstRow="1" w:lastRow="0" w:firstColumn="1" w:lastColumn="0" w:noHBand="0" w:noVBand="1"/>
+      </w:tblPr>
+      <w:tblGrid>
+        <w:gridCol w:w="4680"/>
+        <w:gridCol w:w="4680"/>
+      </w:tblGrid>
+      <w:tr>
+        <w:trPr>
+          <w:tblHeader/>
+        </w:trPr>
+        <w:tc>
+          <w:tcPr>
+            <w:tcW w:w="4680" w:type="dxa"/>
+            <w:tcBorders>
+              <w:top w:val="single" w:sz="4" w:space="0" w:color="D9E0DA"/>
+              <w:left w:val="single" w:sz="4" w:space="0" w:color="D9E0DA"/>
+              <w:bottom w:val="single" w:sz="4" w:space="0" w:color="D9E0DA"/>
+              <w:right w:val="single" w:sz="4" w:space="0" w:color="D9E0DA"/>
+            </w:tcBorders>
+            <w:shd w:val="clear" w:color="auto" w:fill="14302A"/>
+            <w:tcMar>
+              <w:top w:w="60" w:type="dxa"/>
+              <w:left w:w="100" w:type="dxa"/>
+              <w:bottom w:w="60" w:type="dxa"/>
+              <w:right w:w="100" w:type="dxa"/>
+            </w:tcMar>
+          </w:tcPr>
+          <w:p>
+            <w:r>
+              <w:rPr>
+                <w:b/>
+                <w:bCs/>
+                <w:color w:val="FFFFFF"/>
+                <w:sz w:val="20"/>
+                <w:szCs w:val="20"/>
+              </w:rPr>
+              <w:t>Free (for everyone, always)</w:t>
+            </w:r>
+          </w:p>
+        </w:tc>
+        <w:tc>
+          <w:tcPr>
+            <w:tcW w:w="4680" w:type="dxa"/>
+            <w:tcBorders>
+              <w:top w:val="single" w:sz="4" w:space="0" w:color="D9E0DA"/>
+              <w:left w:val="single" w:sz="4" w:space="0" w:color="D9E0DA"/>
+              <w:bottom w:val="single" w:sz="4" w:space="0" w:color="D9E0DA"/>
+              <w:right w:val="single" w:sz="4" w:space="0" w:color="D9E0DA"/>
+            </w:tcBorders>
+            <w:shd w:val="clear" w:color="auto" w:fill="14302A"/>
+            <w:tcMar>
+              <w:top w:w="60" w:type="dxa"/>
+              <w:left w:w="100" w:type="dxa"/>
+              <w:bottom w:w="60" w:type="dxa"/>
+              <w:right w:w="100" w:type="dxa"/>
+            </w:tcMar>
+          </w:tcPr>
+          <w:p>
+            <w:r>
+              <w:rPr>
+                <w:b/>
+                <w:bCs/>
+                <w:color w:val="FFFFFF"/>
+                <w:sz w:val="20"/>
+                <w:szCs w:val="20"/>
+              </w:rPr>
+              <w:t>TruthShift Plus (~$3/month, proposed)</w:t>
+            </w:r>
+          </w:p>
+        </w:tc>
+      </w:tr>
+      <w:tr>
+        <w:tc>
+          <w:tcPr>
+            <w:tcW w:w="4680" w:type="dxa"/>
+            <w:tcBorders>
+              <w:top w:val="single" w:sz="4" w:space="0" w:color="D9E0DA"/>
+              <w:left w:val="single" w:sz="4" w:space="0" w:color="D9E0DA"/>
+              <w:bottom w:val="single" w:sz="4" w:space="0" w:color="D9E0DA"/>
+              <w:right w:val="single" w:sz="4" w:space="0" w:color="D9E0DA"/>
+            </w:tcBorders>
+            <w:tcMar>
+              <w:top w:w="60" w:type="dxa"/>
+              <w:left w:w="100" w:type="dxa"/>
+              <w:bottom w:w="60" w:type="dxa"/>
+              <w:right w:w="100" w:type="dxa"/>
+            </w:tcMar>
+          </w:tcPr>
+          <w:p>
+            <w:r>
+              <w:t>Scanning and personal scores</w:t>
+            </w:r>
+          </w:p>
+        </w:tc>
+        <w:tc>
+          <w:tcPr>
+            <w:tcW w:w="4680" w:type="dxa"/>
+            <w:tcBorders>
+              <w:top w:val="single" w:sz="4" w:space="0" w:color="D9E0DA"/>
+              <w:left w:val="single" w:sz="4" w:space="0" w:color="D9E0DA"/>
+              <w:bottom w:val="single" w:sz="4" w:space="0" w:color="D9E0DA"/>
+              <w:right w:val="single" w:sz="4" w:space="0" w:color="D9E0DA"/>
+            </w:tcBorders>
+            <w:tcMar>
+              <w:top w:w="60" w:type="dxa"/>
+              <w:left w:w="100" w:type="dxa"/>
+              <w:bottom w:w="60" w:type="dxa"/>
+              <w:right w:w="100" w:type="dxa"/>
+            </w:tcMar>
+          </w:tcPr>
+          <w:p>
+            <w:r>
+              <w:t>Unlimited AI assistant</w:t>
+            </w:r>
+          </w:p>
+        </w:tc>
+      </w:tr>
+      <w:tr>
+        <w:tc>
+          <w:tcPr>
+            <w:tcW w:w="4680" w:type="dxa"/>
+            <w:tcBorders>
+              <w:top w:val="single" w:sz="4" w:space="0" w:color="D9E0DA"/>
+              <w:left w:val="single" w:sz="4" w:space="0" w:color="D9E0DA"/>
+              <w:bottom w:val="single" w:sz="4" w:space="0" w:color="D9E0DA"/>
+              <w:right w:val="single" w:sz="4" w:space="0" w:color="D9E0DA"/>
+            </w:tcBorders>
+            <w:shd w:val="clear" w:color="auto" w:fill="F7F9F7"/>
+            <w:tcMar>
+              <w:top w:w="60" w:type="dxa"/>
+              <w:left w:w="100" w:type="dxa"/>
+              <w:bottom w:w="60" w:type="dxa"/>
+              <w:right w:w="100" w:type="dxa"/>
+            </w:tcMar>
+          </w:tcPr>
+          <w:p>
+            <w:r>
+              <w:t>Evidence label on every fact</w:t>
+            </w:r>
+          </w:p>
+        </w:tc>
+        <w:tc>
+          <w:tcPr>
+            <w:tcW w:w="4680" w:type="dxa"/>
+            <w:tcBorders>
+              <w:top w:val="single" w:sz="4" w:space="0" w:color="D9E0DA"/>
+              <w:left w:val="single" w:sz="4" w:space="0" w:color="D9E0DA"/>
+              <w:bottom w:val="single" w:sz="4" w:space="0" w:color="D9E0DA"/>
+              <w:right w:val="single" w:sz="4" w:space="0" w:color="D9E0DA"/>
+            </w:tcBorders>
+            <w:shd w:val="clear" w:color="auto" w:fill="F7F9F7"/>
+            <w:tcMar>
+              <w:top w:w="60" w:type="dxa"/>
+              <w:left w:w="100" w:type="dxa"/>
+              <w:bottom w:w="60" w:type="dxa"/>
+              <w:right w:w="100" w:type="dxa"/>
+            </w:tcMar>
+          </w:tcPr>
+          <w:p>
+            <w:r>
+              <w:t>Shopping-list planner that finds the best store</w:t>
+            </w:r>
+          </w:p>
+        </w:tc>
+      </w:tr>
+      <w:tr>
+        <w:tc>
+          <w:tcPr>
+            <w:tcW w:w="4680" w:type="dxa"/>
+            <w:tcBorders>
+              <w:top w:val="single" w:sz="4" w:space="0" w:color="D9E0DA"/>
+              <w:left w:val="single" w:sz="4" w:space="0" w:color="D9E0DA"/>
+              <w:bottom w:val="single" w:sz="4" w:space="0" w:color="D9E0DA"/>
+              <w:right w:val="single" w:sz="4" w:space="0" w:color="D9E0DA"/>
+            </w:tcBorders>
+            <w:tcMar>
+              <w:top w:w="60" w:type="dxa"/>
+              <w:left w:w="100" w:type="dxa"/>
+              <w:bottom w:w="60" w:type="dxa"/>
+              <w:right w:w="100" w:type="dxa"/>
+            </w:tcMar>
+          </w:tcPr>
+          <w:p>
+            <w:r>
+              <w:t>Compare, store map, all languages</w:t>
+            </w:r>
+          </w:p>
+        </w:tc>
+        <w:tc>
+          <w:tcPr>
+            <w:tcW w:w="4680" w:type="dxa"/>
+            <w:tcBorders>
+              <w:top w:val="single" w:sz="4" w:space="0" w:color="D9E0DA"/>
+              <w:left w:val="single" w:sz="4" w:space="0" w:color="D9E0DA"/>
+              <w:bottom w:val="single" w:sz="4" w:space="0" w:color="D9E0DA"/>
+              <w:right w:val="single" w:sz="4" w:space="0" w:color="D9E0DA"/>
+            </w:tcBorders>
+            <w:tcMar>
+              <w:top w:w="60" w:type="dxa"/>
+              <w:left w:w="100" w:type="dxa"/>
+              <w:bottom w:w="60" w:type="dxa"/>
+              <w:right w:w="100" w:type="dxa"/>
+            </w:tcMar>
+          </w:tcPr>
+          <w:p>
+            <w:r>
+              <w:t>Price-drop alerts from store flyers</w:t>
+            </w:r>
+          </w:p>
+        </w:tc>
+      </w:tr>
+      <w:tr>
+        <w:tc>
+          <w:tcPr>
+            <w:tcW w:w="4680" w:type="dxa"/>
+            <w:tcBorders>
+              <w:top w:val="single" w:sz="4" w:space="0" w:color="D9E0DA"/>
+              <w:left w:val="single" w:sz="4" w:space="0" w:color="D9E0DA"/>
+              <w:bottom w:val="single" w:sz="4" w:space="0" w:color="D9E0DA"/>
+              <w:right w:val="single" w:sz="4" w:space="0" w:color="D9E0DA"/>
+            </w:tcBorders>
+            <w:shd w:val="clear" w:color="auto" w:fill="F7F9F7"/>
+            <w:tcMar>
+              <w:top w:w="60" w:type="dxa"/>
+              <w:left w:w="100" w:type="dxa"/>
+              <w:bottom w:w="60" w:type="dxa"/>
+              <w:right w:w="100" w:type="dxa"/>
+            </w:tcMar>
+          </w:tcPr>
+          <w:p>
+            <w:r>
+              <w:t>A few AI questions a day</w:t>
+            </w:r>
+          </w:p>
+        </w:tc>
+        <w:tc>
+          <w:tcPr>
+            <w:tcW w:w="4680" w:type="dxa"/>
+            <w:tcBorders>
+              <w:top w:val="single" w:sz="4" w:space="0" w:color="D9E0DA"/>
+              <w:left w:val="single" w:sz="4" w:space="0" w:color="D9E0DA"/>
+              <w:bottom w:val="single" w:sz="4" w:space="0" w:color="D9E0DA"/>
+              <w:right w:val="single" w:sz="4" w:space="0" w:color="D9E0DA"/>
+            </w:tcBorders>
+            <w:shd w:val="clear" w:color="auto" w:fill="F7F9F7"/>
+            <w:tcMar>
+              <w:top w:w="60" w:type="dxa"/>
+              <w:left w:w="100" w:type="dxa"/>
+              <w:bottom w:w="60" w:type="dxa"/>
+              <w:right w:w="100" w:type="dxa"/>
+            </w:tcMar>
+          </w:tcPr>
+          <w:p>
+            <w:r>
+              <w:t>Family profiles</w:t>
+            </w:r>
+          </w:p>
+        </w:tc>
+      </w:tr>
+    </w:tbl>
+    <w:p>
+      <w:pPr>
+        <w:spacing w:after="120"/>
+      </w:pPr>
+    </w:p>
+    <w:p>
+      <w:pPr>
+        <w:spacing w:after="140"/>
+      </w:pPr>
+      <w:r>
+        <w:t>Today every feature is free and there is no limit on AI questions; the Plus features and the daily limit are proposals to test with users.</w:t>
+      </w:r>
+    </w:p>
+    <w:p>
+      <w:pPr>
+        <w:pStyle w:val="Heading2"/>
+        <w:keepNext/>
+      </w:pPr>
+      <w:bookmarkStart w:id="12" w:name="_Toc242959993"/>
+      <w:r>
+        <w:t>Running costs (USD per month, October 2026)</w:t>
+      </w:r>
+      <w:bookmarkEnd w:id="12"/>
+    </w:p>
+    <w:tbl>
+      <w:tblPr>
+        <w:tblW w:w="9360" w:type="dxa"/>
+        <w:tblBorders>
+          <w:top w:val="single" w:sz="4" w:space="0" w:color="auto"/>
+          <w:left w:val="single" w:sz="4" w:space="0" w:color="auto"/>
+          <w:bottom w:val="single" w:sz="4" w:space="0" w:color="auto"/>
+          <w:right w:val="single" w:sz="4" w:space="0" w:color="auto"/>
+          <w:insideH w:val="single" w:sz="4" w:space="0" w:color="auto"/>
+          <w:insideV w:val="single" w:sz="4" w:space="0" w:color="auto"/>
+        </w:tblBorders>
+        <w:tblLook w:val="04A0" w:firstRow="1" w:lastRow="0" w:firstColumn="1" w:lastColumn="0" w:noHBand="0" w:noVBand="1"/>
+      </w:tblPr>
+      <w:tblGrid>
+        <w:gridCol w:w="3000"/>
+        <w:gridCol w:w="2000"/>
+        <w:gridCol w:w="4360"/>
+      </w:tblGrid>
+      <w:tr>
+        <w:trPr>
+          <w:tblHeader/>
+        </w:trPr>
+        <w:tc>
+          <w:tcPr>
+            <w:tcW w:w="3000" w:type="dxa"/>
+            <w:tcBorders>
+              <w:top w:val="single" w:sz="4" w:space="0" w:color="D9E0DA"/>
+              <w:left w:val="single" w:sz="4" w:space="0" w:color="D9E0DA"/>
+              <w:bottom w:val="single" w:sz="4" w:space="0" w:color="D9E0DA"/>
+              <w:right w:val="single" w:sz="4" w:space="0" w:color="D9E0DA"/>
+            </w:tcBorders>
+            <w:shd w:val="clear" w:color="auto" w:fill="14302A"/>
+            <w:tcMar>
+              <w:top w:w="60" w:type="dxa"/>
+              <w:left w:w="100" w:type="dxa"/>
+              <w:bottom w:w="60" w:type="dxa"/>
+              <w:right w:w="100" w:type="dxa"/>
+            </w:tcMar>
+          </w:tcPr>
+          <w:p>
+            <w:r>
+              <w:rPr>
+                <w:b/>
+                <w:bCs/>
+                <w:color w:val="FFFFFF"/>
+                <w:sz w:val="20"/>
+                <w:szCs w:val="20"/>
+              </w:rPr>
+              <w:t>Item</w:t>
+            </w:r>
+          </w:p>
+        </w:tc>
+        <w:tc>
+          <w:tcPr>
+            <w:tcW w:w="2000" w:type="dxa"/>
+            <w:tcBorders>
+              <w:top w:val="single" w:sz="4" w:space="0" w:color="D9E0DA"/>
+              <w:left w:val="single" w:sz="4" w:space="0" w:color="D9E0DA"/>
+              <w:bottom w:val="single" w:sz="4" w:space="0" w:color="D9E0DA"/>
+              <w:right w:val="single" w:sz="4" w:space="0" w:color="D9E0DA"/>
+            </w:tcBorders>
+            <w:shd w:val="clear" w:color="auto" w:fill="14302A"/>
+            <w:tcMar>
+              <w:top w:w="60" w:type="dxa"/>
+              <w:left w:w="100" w:type="dxa"/>
+              <w:bottom w:w="60" w:type="dxa"/>
+              <w:right w:w="100" w:type="dxa"/>
+            </w:tcMar>
+          </w:tcPr>
+          <w:p>
+            <w:r>
+              <w:rPr>
+                <w:b/>
+                <w:bCs/>
+                <w:color w:val="FFFFFF"/>
+                <w:sz w:val="20"/>
+                <w:szCs w:val="20"/>
+              </w:rPr>
+              <w:t>Cost</w:t>
+            </w:r>
+          </w:p>
+        </w:tc>
+        <w:tc>
+          <w:tcPr>
+            <w:tcW w:w="4360" w:type="dxa"/>
+            <w:tcBorders>
+              <w:top w:val="single" w:sz="4" w:space="0" w:color="D9E0DA"/>
+              <w:left w:val="single" w:sz="4" w:space="0" w:color="D9E0DA"/>
+              <w:bottom w:val="single" w:sz="4" w:space="0" w:color="D9E0DA"/>
+              <w:right w:val="single" w:sz="4" w:space="0" w:color="D9E0DA"/>
+            </w:tcBorders>
+            <w:shd w:val="clear" w:color="auto" w:fill="14302A"/>
+            <w:tcMar>
+              <w:top w:w="60" w:type="dxa"/>
+              <w:left w:w="100" w:type="dxa"/>
+              <w:bottom w:w="60" w:type="dxa"/>
+              <w:right w:w="100" w:type="dxa"/>
+            </w:tcMar>
+          </w:tcPr>
+          <w:p>
+            <w:r>
+              <w:rPr>
+                <w:b/>
+                <w:bCs/>
+                <w:color w:val="FFFFFF"/>
+                <w:sz w:val="20"/>
+                <w:szCs w:val="20"/>
+              </w:rPr>
+              <w:t>Notes</w:t>
+            </w:r>
+          </w:p>
+        </w:tc>
+      </w:tr>
+      <w:tr>
+        <w:tc>
+          <w:tcPr>
+            <w:tcW w:w="3000" w:type="dxa"/>
+            <w:tcBorders>
+              <w:top w:val="single" w:sz="4" w:space="0" w:color="D9E0DA"/>
+              <w:left w:val="single" w:sz="4" w:space="0" w:color="D9E0DA"/>
+              <w:bottom w:val="single" w:sz="4" w:space="0" w:color="D9E0DA"/>
+              <w:right w:val="single" w:sz="4" w:space="0" w:color="D9E0DA"/>
+            </w:tcBorders>
+            <w:tcMar>
+              <w:top w:w="60" w:type="dxa"/>
+              <w:left w:w="100" w:type="dxa"/>
+              <w:bottom w:w="60" w:type="dxa"/>
+              <w:right w:w="100" w:type="dxa"/>
+            </w:tcMar>
+          </w:tcPr>
+          <w:p>
+            <w:r>
+              <w:t>Frontend hosting</w:t>
+            </w:r>
+          </w:p>
+        </w:tc>
+        <w:tc>
+          <w:tcPr>
+            <w:tcW w:w="2000" w:type="dxa"/>
+            <w:tcBorders>
+              <w:top w:val="single" w:sz="4" w:space="0" w:color="D9E0DA"/>
+              <w:left w:val="single" w:sz="4" w:space="0" w:color="D9E0DA"/>
+              <w:bottom w:val="single" w:sz="4" w:space="0" w:color="D9E0DA"/>
+              <w:right w:val="single" w:sz="4" w:space="0" w:color="D9E0DA"/>
+            </w:tcBorders>
+            <w:tcMar>
+              <w:top w:w="60" w:type="dxa"/>
+              <w:left w:w="100" w:type="dxa"/>
+              <w:bottom w:w="60" w:type="dxa"/>
+              <w:right w:w="100" w:type="dxa"/>
+            </w:tcMar>
+          </w:tcPr>
+          <w:p>
+            <w:r>
+              <w:t>$0</w:t>
+            </w:r>
+          </w:p>
+        </w:tc>
+        <w:tc>
+          <w:tcPr>
+            <w:tcW w:w="4360" w:type="dxa"/>
+            <w:tcBorders>
+              <w:top w:val="single" w:sz="4" w:space="0" w:color="D9E0DA"/>
+              <w:left w:val="single" w:sz="4" w:space="0" w:color="D9E0DA"/>
+              <w:bottom w:val="single" w:sz="4" w:space="0" w:color="D9E0DA"/>
+              <w:right w:val="single" w:sz="4" w:space="0" w:color="D9E0DA"/>
+            </w:tcBorders>
+            <w:tcMar>
+              <w:top w:w="60" w:type="dxa"/>
+              <w:left w:w="100" w:type="dxa"/>
+              <w:bottom w:w="60" w:type="dxa"/>
+              <w:right w:w="100" w:type="dxa"/>
+            </w:tcMar>
+          </w:tcPr>
+          <w:p>
+            <w:r>
+              <w:t>React app as a free static site</w:t>
+            </w:r>
+          </w:p>
+        </w:tc>
+      </w:tr>
+      <w:tr>
+        <w:tc>
+          <w:tcPr>
+            <w:tcW w:w="3000" w:type="dxa"/>
+            <w:tcBorders>
+              <w:top w:val="single" w:sz="4" w:space="0" w:color="D9E0DA"/>
+              <w:left w:val="single" w:sz="4" w:space="0" w:color="D9E0DA"/>
+              <w:bottom w:val="single" w:sz="4" w:space="0" w:color="D9E0DA"/>
+              <w:right w:val="single" w:sz="4" w:space="0" w:color="D9E0DA"/>
+            </w:tcBorders>
+            <w:shd w:val="clear" w:color="auto" w:fill="F7F9F7"/>
+            <w:tcMar>
+              <w:top w:w="60" w:type="dxa"/>
+              <w:left w:w="100" w:type="dxa"/>
+              <w:bottom w:w="60" w:type="dxa"/>
+              <w:right w:w="100" w:type="dxa"/>
+            </w:tcMar>
+          </w:tcPr>
+          <w:p>
+            <w:r>
+              <w:t>Backend hosting</w:t>
+            </w:r>
+          </w:p>
+        </w:tc>
+        <w:tc>
+          <w:tcPr>
+            <w:tcW w:w="2000" w:type="dxa"/>
+            <w:tcBorders>
+              <w:top w:val="single" w:sz="4" w:space="0" w:color="D9E0DA"/>
+              <w:left w:val="single" w:sz="4" w:space="0" w:color="D9E0DA"/>
+              <w:bottom w:val="single" w:sz="4" w:space="0" w:color="D9E0DA"/>
+              <w:right w:val="single" w:sz="4" w:space="0" w:color="D9E0DA"/>
+            </w:tcBorders>
+            <w:shd w:val="clear" w:color="auto" w:fill="F7F9F7"/>
+            <w:tcMar>
+              <w:top w:w="60" w:type="dxa"/>
+              <w:left w:w="100" w:type="dxa"/>
+              <w:bottom w:w="60" w:type="dxa"/>
+              <w:right w:w="100" w:type="dxa"/>
+            </w:tcMar>
+          </w:tcPr>
+          <w:p>
+            <w:r>
+              <w:t>$7</w:t>
+            </w:r>
+          </w:p>
+        </w:tc>
+        <w:tc>
+          <w:tcPr>
+            <w:tcW w:w="4360" w:type="dxa"/>
+            <w:tcBorders>
+              <w:top w:val="single" w:sz="4" w:space="0" w:color="D9E0DA"/>
+              <w:left w:val="single" w:sz="4" w:space="0" w:color="D9E0DA"/>
+              <w:bottom w:val="single" w:sz="4" w:space="0" w:color="D9E0DA"/>
+              <w:right w:val="single" w:sz="4" w:space="0" w:color="D9E0DA"/>
+            </w:tcBorders>
+            <w:shd w:val="clear" w:color="auto" w:fill="F7F9F7"/>
+            <w:tcMar>
+              <w:top w:w="60" w:type="dxa"/>
+              <w:left w:w="100" w:type="dxa"/>
+              <w:bottom w:w="60" w:type="dxa"/>
+              <w:right w:w="100" w:type="dxa"/>
+            </w:tcMar>
+          </w:tcPr>
+          <w:p>
+            <w:r>
+              <w:t>Render Starter web service (0.5 CPU, 512 MB)</w:t>
+            </w:r>
+          </w:p>
+        </w:tc>
+      </w:tr>
+      <w:tr>
+        <w:tc>
+          <w:tcPr>
+            <w:tcW w:w="3000" w:type="dxa"/>
+            <w:tcBorders>
+              <w:top w:val="single" w:sz="4" w:space="0" w:color="D9E0DA"/>
+              <w:left w:val="single" w:sz="4" w:space="0" w:color="D9E0DA"/>
+              <w:bottom w:val="single" w:sz="4" w:space="0" w:color="D9E0DA"/>
+              <w:right w:val="single" w:sz="4" w:space="0" w:color="D9E0DA"/>
+            </w:tcBorders>
+            <w:tcMar>
+              <w:top w:w="60" w:type="dxa"/>
+              <w:left w:w="100" w:type="dxa"/>
+              <w:bottom w:w="60" w:type="dxa"/>
+              <w:right w:w="100" w:type="dxa"/>
+            </w:tcMar>
+          </w:tcPr>
+          <w:p>
+            <w:r>
+              <w:t>Domain (.ca)</w:t>
+            </w:r>
+          </w:p>
+        </w:tc>
+        <w:tc>
+          <w:tcPr>
+            <w:tcW w:w="2000" w:type="dxa"/>
+            <w:tcBorders>
+              <w:top w:val="single" w:sz="4" w:space="0" w:color="D9E0DA"/>
+              <w:left w:val="single" w:sz="4" w:space="0" w:color="D9E0DA"/>
+              <w:bottom w:val="single" w:sz="4" w:space="0" w:color="D9E0DA"/>
+              <w:right w:val="single" w:sz="4" w:space="0" w:color="D9E0DA"/>
+            </w:tcBorders>
+            <w:tcMar>
+              <w:top w:w="60" w:type="dxa"/>
+              <w:left w:w="100" w:type="dxa"/>
+              <w:bottom w:w="60" w:type="dxa"/>
+              <w:right w:w="100" w:type="dxa"/>
+            </w:tcMar>
+          </w:tcPr>
+          <w:p>
+            <w:r>
+              <w:t>~$1</w:t>
+            </w:r>
+          </w:p>
+        </w:tc>
+        <w:tc>
+          <w:tcPr>
+            <w:tcW w:w="4360" w:type="dxa"/>
+            <w:tcBorders>
+              <w:top w:val="single" w:sz="4" w:space="0" w:color="D9E0DA"/>
+              <w:left w:val="single" w:sz="4" w:space="0" w:color="D9E0DA"/>
+              <w:bottom w:val="single" w:sz="4" w:space="0" w:color="D9E0DA"/>
+              <w:right w:val="single" w:sz="4" w:space="0" w:color="D9E0DA"/>
+            </w:tcBorders>
+            <w:tcMar>
+              <w:top w:w="60" w:type="dxa"/>
+              <w:left w:w="100" w:type="dxa"/>
+              <w:bottom w:w="60" w:type="dxa"/>
+              <w:right w:w="100" w:type="dxa"/>
+            </w:tcMar>
+          </w:tcPr>
+          <w:p>
+            <w:r>
+              <w:t>About $8–10 a year</w:t>
+            </w:r>
+          </w:p>
+        </w:tc>
+      </w:tr>
+      <w:tr>
+        <w:tc>
+          <w:tcPr>
+            <w:tcW w:w="3000" w:type="dxa"/>
+            <w:tcBorders>
+              <w:top w:val="single" w:sz="4" w:space="0" w:color="D9E0DA"/>
+              <w:left w:val="single" w:sz="4" w:space="0" w:color="D9E0DA"/>
+              <w:bottom w:val="single" w:sz="4" w:space="0" w:color="D9E0DA"/>
+              <w:right w:val="single" w:sz="4" w:space="0" w:color="D9E0DA"/>
+            </w:tcBorders>
+            <w:shd w:val="clear" w:color="auto" w:fill="F7F9F7"/>
+            <w:tcMar>
+              <w:top w:w="60" w:type="dxa"/>
+              <w:left w:w="100" w:type="dxa"/>
+              <w:bottom w:w="60" w:type="dxa"/>
+              <w:right w:w="100" w:type="dxa"/>
+            </w:tcMar>
+          </w:tcPr>
+          <w:p>
+            <w:r>
+              <w:t>Product data</w:t>
+            </w:r>
+          </w:p>
+        </w:tc>
+        <w:tc>
+          <w:tcPr>
+            <w:tcW w:w="2000" w:type="dxa"/>
+            <w:tcBorders>
+              <w:top w:val="single" w:sz="4" w:space="0" w:color="D9E0DA"/>
+              <w:left w:val="single" w:sz="4" w:space="0" w:color="D9E0DA"/>
+              <w:bottom w:val="single" w:sz="4" w:space="0" w:color="D9E0DA"/>
+              <w:right w:val="single" w:sz="4" w:space="0" w:color="D9E0DA"/>
+            </w:tcBorders>
+            <w:shd w:val="clear" w:color="auto" w:fill="F7F9F7"/>
+            <w:tcMar>
+              <w:top w:w="60" w:type="dxa"/>
+              <w:left w:w="100" w:type="dxa"/>
+              <w:bottom w:w="60" w:type="dxa"/>
+              <w:right w:w="100" w:type="dxa"/>
+            </w:tcMar>
+          </w:tcPr>
+          <w:p>
+            <w:r>
+              <w:t>$0</w:t>
+            </w:r>
+          </w:p>
+        </w:tc>
+        <w:tc>
+          <w:tcPr>
+            <w:tcW w:w="4360" w:type="dxa"/>
+            <w:tcBorders>
+              <w:top w:val="single" w:sz="4" w:space="0" w:color="D9E0DA"/>
+              <w:left w:val="single" w:sz="4" w:space="0" w:color="D9E0DA"/>
+              <w:bottom w:val="single" w:sz="4" w:space="0" w:color="D9E0DA"/>
+              <w:right w:val="single" w:sz="4" w:space="0" w:color="D9E0DA"/>
+            </w:tcBorders>
+            <w:shd w:val="clear" w:color="auto" w:fill="F7F9F7"/>
+            <w:tcMar>
+              <w:top w:w="60" w:type="dxa"/>
+              <w:left w:w="100" w:type="dxa"/>
+              <w:bottom w:w="60" w:type="dxa"/>
+              <w:right w:w="100" w:type="dxa"/>
+            </w:tcMar>
+          </w:tcPr>
+          <w:p>
+            <w:r>
+              <w:t>Open Food Facts (open data, ODbL)</w:t>
+            </w:r>
+          </w:p>
+        </w:tc>
+      </w:tr>
+      <w:tr>
+        <w:tc>
+          <w:tcPr>
+            <w:tcW w:w="3000" w:type="dxa"/>
+            <w:tcBorders>
+              <w:top w:val="single" w:sz="4" w:space="0" w:color="D9E0DA"/>
+              <w:left w:val="single" w:sz="4" w:space="0" w:color="D9E0DA"/>
+              <w:bottom w:val="single" w:sz="4" w:space="0" w:color="D9E0DA"/>
+              <w:right w:val="single" w:sz="4" w:space="0" w:color="D9E0DA"/>
+            </w:tcBorders>
+            <w:tcMar>
+              <w:top w:w="60" w:type="dxa"/>
+              <w:left w:w="100" w:type="dxa"/>
+              <w:bottom w:w="60" w:type="dxa"/>
+              <w:right w:w="100" w:type="dxa"/>
+            </w:tcMar>
+          </w:tcPr>
+          <w:p>
+            <w:r>
+              <w:t>Maps</w:t>
+            </w:r>
+          </w:p>
+        </w:tc>
+        <w:tc>
+          <w:tcPr>
+            <w:tcW w:w="2000" w:type="dxa"/>
+            <w:tcBorders>
+              <w:top w:val="single" w:sz="4" w:space="0" w:color="D9E0DA"/>
+              <w:left w:val="single" w:sz="4" w:space="0" w:color="D9E0DA"/>
+              <w:bottom w:val="single" w:sz="4" w:space="0" w:color="D9E0DA"/>
+              <w:right w:val="single" w:sz="4" w:space="0" w:color="D9E0DA"/>
+            </w:tcBorders>
+            <w:tcMar>
+              <w:top w:w="60" w:type="dxa"/>
+              <w:left w:w="100" w:type="dxa"/>
+              <w:bottom w:w="60" w:type="dxa"/>
+              <w:right w:w="100" w:type="dxa"/>
+            </w:tcMar>
+          </w:tcPr>
+          <w:p>
+            <w:r>
+              <w:t>$0 to start</w:t>
+            </w:r>
+          </w:p>
+        </w:tc>
+        <w:tc>
+          <w:tcPr>
+            <w:tcW w:w="4360" w:type="dxa"/>
+            <w:tcBorders>
+              <w:top w:val="single" w:sz="4" w:space="0" w:color="D9E0DA"/>
+              <w:left w:val="single" w:sz="4" w:space="0" w:color="D9E0DA"/>
+              <w:bottom w:val="single" w:sz="4" w:space="0" w:color="D9E0DA"/>
+              <w:right w:val="single" w:sz="4" w:space="0" w:color="D9E0DA"/>
+            </w:tcBorders>
+            <w:tcMar>
+              <w:top w:w="60" w:type="dxa"/>
+              <w:left w:w="100" w:type="dxa"/>
+              <w:bottom w:w="60" w:type="dxa"/>
+              <w:right w:w="100" w:type="dxa"/>
+            </w:tcMar>
+          </w:tcPr>
+          <w:p>
+            <w:r>
+              <w:t>OpenStreetMap; at higher traffic a provider such as MapTiler (free up to 5,000 sessions a month, non-commercial)</w:t>
+            </w:r>
+          </w:p>
+        </w:tc>
+      </w:tr>
+      <w:tr>
+        <w:tc>
+          <w:tcPr>
+            <w:tcW w:w="3000" w:type="dxa"/>
+            <w:tcBorders>
+              <w:top w:val="single" w:sz="4" w:space="0" w:color="D9E0DA"/>
+              <w:left w:val="single" w:sz="4" w:space="0" w:color="D9E0DA"/>
+              <w:bottom w:val="single" w:sz="4" w:space="0" w:color="D9E0DA"/>
+              <w:right w:val="single" w:sz="4" w:space="0" w:color="D9E0DA"/>
+            </w:tcBorders>
+            <w:shd w:val="clear" w:color="auto" w:fill="F7F9F7"/>
+            <w:tcMar>
+              <w:top w:w="60" w:type="dxa"/>
+              <w:left w:w="100" w:type="dxa"/>
+              <w:bottom w:w="60" w:type="dxa"/>
+              <w:right w:w="100" w:type="dxa"/>
+            </w:tcMar>
+          </w:tcPr>
+          <w:p>
+            <w:r>
+              <w:t>AI answers</w:t>
+            </w:r>
+          </w:p>
+        </w:tc>
+        <w:tc>
+          <w:tcPr>
+            <w:tcW w:w="2000" w:type="dxa"/>
+            <w:tcBorders>
+              <w:top w:val="single" w:sz="4" w:space="0" w:color="D9E0DA"/>
+              <w:left w:val="single" w:sz="4" w:space="0" w:color="D9E0DA"/>
+              <w:bottom w:val="single" w:sz="4" w:space="0" w:color="D9E0DA"/>
+              <w:right w:val="single" w:sz="4" w:space="0" w:color="D9E0DA"/>
+            </w:tcBorders>
+            <w:shd w:val="clear" w:color="auto" w:fill="F7F9F7"/>
+            <w:tcMar>
+              <w:top w:w="60" w:type="dxa"/>
+              <w:left w:w="100" w:type="dxa"/>
+              <w:bottom w:w="60" w:type="dxa"/>
+              <w:right w:w="100" w:type="dxa"/>
+            </w:tcMar>
+          </w:tcPr>
+          <w:p>
+            <w:r>
+              <w:t>~$0.02 per question</w:t>
+            </w:r>
+          </w:p>
+        </w:tc>
+        <w:tc>
+          <w:tcPr>
+            <w:tcW w:w="4360" w:type="dxa"/>
+            <w:tcBorders>
+              <w:top w:val="single" w:sz="4" w:space="0" w:color="D9E0DA"/>
+              <w:left w:val="single" w:sz="4" w:space="0" w:color="D9E0DA"/>
+              <w:bottom w:val="single" w:sz="4" w:space="0" w:color="D9E0DA"/>
+              <w:right w:val="single" w:sz="4" w:space="0" w:color="D9E0DA"/>
+            </w:tcBorders>
+            <w:shd w:val="clear" w:color="auto" w:fill="F7F9F7"/>
+            <w:tcMar>
+              <w:top w:w="60" w:type="dxa"/>
+              <w:left w:w="100" w:type="dxa"/>
+              <w:bottom w:w="60" w:type="dxa"/>
+              <w:right w:w="100" w:type="dxa"/>
+            </w:tcMar>
+          </w:tcPr>
+          <w:p>
+            <w:r>
+              <w:t>Claude (claude-opus-5-5) with prompt caching; each question sends about 12,000 tokens of product data</w:t>
+            </w:r>
+          </w:p>
+        </w:tc>
+      </w:tr>
+    </w:tbl>
+    <w:p>
+      <w:pPr>
+        <w:spacing w:after="120"/>
+      </w:pPr>
+    </w:p>
+    <w:p>
+      <w:pPr>
+        <w:spacing w:after="140"/>
+      </w:pPr>
+      <w:r>
+        <w:t xml:space="preserve">That is about </w:t>
+      </w:r>
+      <w:r>
+        <w:rPr>
+          <w:b/>
+          <w:bCs/>
+        </w:rPr>
+        <w:t>$8 a month to launch</w:t>
+      </w:r>
+      <w:r>
+        <w:t xml:space="preserve">, about </w:t>
+      </w:r>
+      <w:r>
+        <w:rPr>
+          <w:b/>
+          <w:bCs/>
+        </w:rPr>
+        <w:t>$28 a month</w:t>
+      </w:r>
+      <w:r>
+        <w:t xml:space="preserve"> with 1,000 AI questions, and about </w:t>
+      </w:r>
+      <w:r>
+        <w:rPr>
+          <w:b/>
+          <w:bCs/>
+        </w:rPr>
+        <w:t>$208 a month</w:t>
+      </w:r>
+      <w:r>
+        <w:t xml:space="preserve"> with 10,000. The AI is the only cost that grows with use, which is why unlimited AI is the Plus feature. These are estimates from public prices; check them before launch.</w:t>
+      </w:r>
+    </w:p>
+    <w:p>
+      <w:pPr>
+        <w:spacing w:after="140"/>
+      </w:pPr>
+      <w:r>
+        <w:t xml:space="preserve">Sources: </w:t>
+      </w:r>
+      <w:hyperlink r:id="rId9" w:history="1">
+        <w:r>
+          <w:rPr>
+            <w:rStyle w:val="Hyperlink"/>
+            <w:color w:val="1F7A4D"/>
+          </w:rPr>
+          <w:t>Render pricing</w:t>
+        </w:r>
+      </w:hyperlink>
+      <w:r>
+        <w:t xml:space="preserve">, </w:t>
+      </w:r>
+      <w:hyperlink r:id="rId10" w:history="1">
+        <w:r>
+          <w:rPr>
+            <w:rStyle w:val="Hyperlink"/>
+            <w:color w:val="1F7A4D"/>
+          </w:rPr>
+          <w:t>MapTiler Cloud pricing</w:t>
+        </w:r>
+      </w:hyperlink>
+      <w:r>
+        <w:t xml:space="preserve">, </w:t>
+      </w:r>
+      <w:hyperlink r:id="rId11" w:history="1">
+        <w:r>
+          <w:rPr>
+            <w:rStyle w:val="Hyperlink"/>
+            <w:color w:val="1F7A4D"/>
+          </w:rPr>
+          <w:t>.ca domain prices</w:t>
+        </w:r>
+      </w:hyperlink>
+      <w:r>
+        <w:t>, Claude API pricing (Anthropic).</w:t>
+      </w:r>
+    </w:p>
+    <w:p>
+      <w:pPr>
+        <w:pStyle w:val="Heading1"/>
+        <w:keepNext/>
+      </w:pPr>
+      <w:bookmarkStart w:id="13" w:name="_Toc242959994"/>
+      <w:r>
+        <w:t>9. Limitations and future work</w:t>
+      </w:r>
+      <w:bookmarkEnd w:id="13"/>
     </w:p>
     <w:p>
       <w:pPr>
@@ -5199,12 +6738,13 @@
     <w:p>
       <w:pPr>
         <w:pStyle w:val="Heading2"/>
-      </w:pPr>
-      <w:bookmarkStart w:id="10" w:name="_Toc242959367"/>
+        <w:keepNext/>
+      </w:pPr>
+      <w:bookmarkStart w:id="14" w:name="_Toc242959995"/>
       <w:r>
         <w:t>Next steps</w:t>
       </w:r>
-      <w:bookmarkEnd w:id="10"/>
+      <w:bookmarkEnd w:id="14"/>
     </w:p>
     <w:p>
       <w:pPr>
@@ -5272,7 +6812,7 @@
       </w:r>
     </w:p>
     <w:sectPr>
-      <w:footerReference w:type="default" r:id="rId9"/>
+      <w:footerReference w:type="default" r:id="rId12"/>
       <w:pgSz w:w="12240" w:h="15840"/>
       <w:pgMar w:top="1440" w:right="1440" w:bottom="1440" w:left="1440" w:header="708" w:footer="708" w:gutter="0"/>
       <w:cols w:space="720"/>
@@ -5382,213 +6922,213 @@
 <file path=word/numbering.xml><?xml version="1.0" encoding="utf-8"?>
 <w:numbering xmlns:wpc="http://schemas.microsoft.com/office/word/2010/wordprocessingCanvas" xmlns:cx="http://schemas.microsoft.com/office/drawing/2014/chartex" xmlns:cx1="http://schemas.microsoft.com/office/drawing/2015/9/8/chartex" xmlns:cx2="http://schemas.microsoft.com/office/drawing/2015/10/21/chartex" xmlns:cx3="http://schemas.microsoft.com/office/drawing/2016/5/9/chartex" xmlns:cx4="http://schemas.microsoft.com/office/drawing/2016/5/10/chartex" xmlns:cx5="http://schemas.microsoft.com/office/drawing/2016/5/11/chartex" xmlns:cx6="http://schemas.microsoft.com/office/drawing/2016/5/12/chartex" xmlns:cx7="http://schemas.microsoft.com/office/drawing/2016/5/13/chartex" xmlns:cx8="http://schemas.microsoft.com/office/drawing/2016/5/14/chartex" xmlns:mc="http://schemas.openxmlformats.org/markup-compatibility/2006" xmlns:aink="http://schemas.microsoft.com/office/drawing/2016/ink" xmlns:am3d="http://schemas.microsoft.com/office/drawing/2017/model3d" xmlns:o="urn:schemas-microsoft-com:office:office" xmlns:oel="http://schemas.microsoft.com/office/2019/extlst" xmlns:r="http://schemas.openxmlformats.org/officeDocument/2006/relationships" xmlns:m="http://schemas.openxmlformats.org/officeDocument/2006/math" xmlns:v="urn:schemas-microsoft-com:vml" xmlns:wp14="http://schemas.microsoft.com/office/word/2010/wordprocessingDrawing" xmlns:wp="http://schemas.openxmlformats.org/drawingml/2006/wordprocessingDrawing" xmlns:w10="urn:schemas-microsoft-com:office:word" xmlns:w="http://schemas.openxmlformats.org/wordprocessingml/2006/main" xmlns:w14="http://schemas.microsoft.com/office/word/2010/wordml" xmlns:w15="http://schemas.microsoft.com/office/word/2012/wordml" xmlns:w16cex="http://schemas.microsoft.com/office/word/2018/wordml/cex" xmlns:w16cid="http://schemas.microsoft.com/office/word/2016/wordml/cid" xmlns:w16="http://schemas.microsoft.com/office/word/2018/wordml" xmlns:w16du="http://schemas.microsoft.com/office/word/2023/wordml/word16du" xmlns:w16sdtdh="http://schemas.microsoft.com/office/word/2020/wordml/sdtdatahash" xmlns:w16sdtfl="http://schemas.microsoft.com/office/word/2024/wordml/sdtformatlock" xmlns:w16se="http://schemas.microsoft.com/office/word/2015/wordml/symex" xmlns:wpg="http://schemas.microsoft.com/office/word/2010/wordprocessingGroup" xmlns:wpi="http://schemas.microsoft.com/office/word/2010/wordprocessingInk" xmlns:wne="http://schemas.microsoft.com/office/word/2006/wordml" xmlns:wps="http://schemas.microsoft.com/office/word/2010/wordprocessingShape" mc:Ignorable="w14 w15 w16se w16cid w16 w16cex w16sdtdh w16sdtfl w16du wp14">
   <w:abstractNum w:abstractNumId="0" w15:restartNumberingAfterBreak="0">
-    <w:nsid w:val="08B06B7F"/>
+    <w:nsid w:val="019A3085"/>
     <w:multiLevelType w:val="hybridMultilevel"/>
-    <w:tmpl w:val="7F86BA78"/>
-    <w:lvl w:ilvl="0" w:tplc="3898845A">
+    <w:tmpl w:val="7A384B5C"/>
+    <w:lvl w:ilvl="0" w:tplc="8188A38E" w:tentative="1">
       <w:start w:val="1"/>
-      <w:numFmt w:val="decimal"/>
-      <w:lvlText w:val="%1."/>
+      <w:numFmt w:val="bullet"/>
+      <w:lvlText w:val="●"/>
       <w:lvlJc w:val="left"/>
       <w:pPr>
-        <w:ind w:left="540" w:hanging="300"/>
+        <w:ind w:left="720" w:hanging="360"/>
       </w:pPr>
     </w:lvl>
-    <w:lvl w:ilvl="1" w:tplc="FC16A3DE">
+    <w:lvl w:ilvl="1" w:tplc="235CE10C" w:tentative="1">
+      <w:start w:val="1"/>
+      <w:numFmt w:val="bullet"/>
+      <w:lvlText w:val="○"/>
+      <w:lvlJc w:val="left"/>
+      <w:pPr>
+        <w:ind w:left="1440" w:hanging="360"/>
+      </w:pPr>
+    </w:lvl>
+    <w:lvl w:ilvl="2" w:tplc="4260EF0E" w:tentative="1">
+      <w:start w:val="1"/>
+      <w:numFmt w:val="bullet"/>
+      <w:lvlText w:val="■"/>
+      <w:lvlJc w:val="left"/>
+      <w:pPr>
+        <w:ind w:left="2160" w:hanging="360"/>
+      </w:pPr>
+    </w:lvl>
+    <w:lvl w:ilvl="3" w:tplc="85044B6C" w:tentative="1">
+      <w:start w:val="1"/>
+      <w:numFmt w:val="bullet"/>
+      <w:lvlText w:val="●"/>
+      <w:lvlJc w:val="left"/>
+      <w:pPr>
+        <w:ind w:left="2880" w:hanging="360"/>
+      </w:pPr>
+    </w:lvl>
+    <w:lvl w:ilvl="4" w:tplc="FF10B4B6" w:tentative="1">
+      <w:start w:val="1"/>
+      <w:numFmt w:val="bullet"/>
+      <w:lvlText w:val="○"/>
+      <w:lvlJc w:val="left"/>
+      <w:pPr>
+        <w:ind w:left="3600" w:hanging="360"/>
+      </w:pPr>
+    </w:lvl>
+    <w:lvl w:ilvl="5" w:tplc="34F02FF8" w:tentative="1">
+      <w:start w:val="1"/>
+      <w:numFmt w:val="bullet"/>
+      <w:lvlText w:val="■"/>
+      <w:lvlJc w:val="left"/>
+      <w:pPr>
+        <w:ind w:left="4320" w:hanging="360"/>
+      </w:pPr>
+    </w:lvl>
+    <w:lvl w:ilvl="6" w:tplc="BE54376C" w:tentative="1">
+      <w:start w:val="1"/>
+      <w:numFmt w:val="bullet"/>
+      <w:lvlText w:val="●"/>
+      <w:lvlJc w:val="left"/>
+      <w:pPr>
+        <w:ind w:left="5040" w:hanging="360"/>
+      </w:pPr>
+    </w:lvl>
+    <w:lvl w:ilvl="7" w:tplc="A912C728" w:tentative="1">
+      <w:start w:val="1"/>
+      <w:numFmt w:val="bullet"/>
+      <w:lvlText w:val="●"/>
+      <w:lvlJc w:val="left"/>
+      <w:pPr>
+        <w:ind w:left="5760" w:hanging="360"/>
+      </w:pPr>
+    </w:lvl>
+    <w:lvl w:ilvl="8" w:tplc="D500054A" w:tentative="1">
+      <w:start w:val="1"/>
+      <w:numFmt w:val="bullet"/>
+      <w:lvlText w:val="●"/>
+      <w:lvlJc w:val="left"/>
+      <w:pPr>
+        <w:ind w:left="6480" w:hanging="360"/>
+      </w:pPr>
+    </w:lvl>
+  </w:abstractNum>
+  <w:abstractNum w:abstractNumId="1" w15:restartNumberingAfterBreak="0">
+    <w:nsid w:val="369B114B"/>
+    <w:multiLevelType w:val="hybridMultilevel"/>
+    <w:tmpl w:val="491C45D4"/>
+    <w:lvl w:ilvl="0" w:tplc="5F104C2E">
+      <w:start w:val="1"/>
+      <w:numFmt w:val="bullet"/>
+      <w:lvlText w:val="•"/>
+      <w:lvlJc w:val="left"/>
+      <w:pPr>
+        <w:ind w:left="540" w:hanging="270"/>
+      </w:pPr>
+    </w:lvl>
+    <w:lvl w:ilvl="1" w:tplc="CFEAE412">
       <w:numFmt w:val="decimal"/>
       <w:lvlText w:val=""/>
       <w:lvlJc w:val="left"/>
     </w:lvl>
-    <w:lvl w:ilvl="2" w:tplc="F8EACECE">
+    <w:lvl w:ilvl="2" w:tplc="07EA0B44">
       <w:numFmt w:val="decimal"/>
       <w:lvlText w:val=""/>
       <w:lvlJc w:val="left"/>
     </w:lvl>
-    <w:lvl w:ilvl="3" w:tplc="38546CEA">
+    <w:lvl w:ilvl="3" w:tplc="8B388408">
       <w:numFmt w:val="decimal"/>
       <w:lvlText w:val=""/>
       <w:lvlJc w:val="left"/>
     </w:lvl>
-    <w:lvl w:ilvl="4" w:tplc="BEB48502">
+    <w:lvl w:ilvl="4" w:tplc="AD7261D4">
       <w:numFmt w:val="decimal"/>
       <w:lvlText w:val=""/>
       <w:lvlJc w:val="left"/>
     </w:lvl>
-    <w:lvl w:ilvl="5" w:tplc="2E7EE26E">
+    <w:lvl w:ilvl="5" w:tplc="727A439E">
       <w:numFmt w:val="decimal"/>
       <w:lvlText w:val=""/>
       <w:lvlJc w:val="left"/>
     </w:lvl>
-    <w:lvl w:ilvl="6" w:tplc="16D8B600">
+    <w:lvl w:ilvl="6" w:tplc="60F61652">
       <w:numFmt w:val="decimal"/>
       <w:lvlText w:val=""/>
       <w:lvlJc w:val="left"/>
     </w:lvl>
-    <w:lvl w:ilvl="7" w:tplc="BAD04CEC">
+    <w:lvl w:ilvl="7" w:tplc="AE22C69C">
       <w:numFmt w:val="decimal"/>
       <w:lvlText w:val=""/>
       <w:lvlJc w:val="left"/>
     </w:lvl>
-    <w:lvl w:ilvl="8" w:tplc="6EB45B5A">
-      <w:numFmt w:val="decimal"/>
-      <w:lvlText w:val=""/>
-      <w:lvlJc w:val="left"/>
-    </w:lvl>
-  </w:abstractNum>
-  <w:abstractNum w:abstractNumId="1" w15:restartNumberingAfterBreak="0">
-    <w:nsid w:val="3D8C714A"/>
-    <w:multiLevelType w:val="hybridMultilevel"/>
-    <w:tmpl w:val="EE64F896"/>
-    <w:lvl w:ilvl="0" w:tplc="3F74C638">
-      <w:start w:val="1"/>
-      <w:numFmt w:val="bullet"/>
-      <w:lvlText w:val="•"/>
-      <w:lvlJc w:val="left"/>
-      <w:pPr>
-        <w:ind w:left="540" w:hanging="270"/>
-      </w:pPr>
-    </w:lvl>
-    <w:lvl w:ilvl="1" w:tplc="CC3CBFF6">
-      <w:numFmt w:val="decimal"/>
-      <w:lvlText w:val=""/>
-      <w:lvlJc w:val="left"/>
-    </w:lvl>
-    <w:lvl w:ilvl="2" w:tplc="C39AA386">
-      <w:numFmt w:val="decimal"/>
-      <w:lvlText w:val=""/>
-      <w:lvlJc w:val="left"/>
-    </w:lvl>
-    <w:lvl w:ilvl="3" w:tplc="D2662554">
-      <w:numFmt w:val="decimal"/>
-      <w:lvlText w:val=""/>
-      <w:lvlJc w:val="left"/>
-    </w:lvl>
-    <w:lvl w:ilvl="4" w:tplc="8042D90E">
-      <w:numFmt w:val="decimal"/>
-      <w:lvlText w:val=""/>
-      <w:lvlJc w:val="left"/>
-    </w:lvl>
-    <w:lvl w:ilvl="5" w:tplc="771E4FD2">
-      <w:numFmt w:val="decimal"/>
-      <w:lvlText w:val=""/>
-      <w:lvlJc w:val="left"/>
-    </w:lvl>
-    <w:lvl w:ilvl="6" w:tplc="7F765CA6">
-      <w:numFmt w:val="decimal"/>
-      <w:lvlText w:val=""/>
-      <w:lvlJc w:val="left"/>
-    </w:lvl>
-    <w:lvl w:ilvl="7" w:tplc="A6FEDF4A">
-      <w:numFmt w:val="decimal"/>
-      <w:lvlText w:val=""/>
-      <w:lvlJc w:val="left"/>
-    </w:lvl>
-    <w:lvl w:ilvl="8" w:tplc="9A205D46">
+    <w:lvl w:ilvl="8" w:tplc="09600FF6">
       <w:numFmt w:val="decimal"/>
       <w:lvlText w:val=""/>
       <w:lvlJc w:val="left"/>
     </w:lvl>
   </w:abstractNum>
   <w:abstractNum w:abstractNumId="2" w15:restartNumberingAfterBreak="0">
-    <w:nsid w:val="4EA60BE7"/>
+    <w:nsid w:val="51D35EFD"/>
     <w:multiLevelType w:val="hybridMultilevel"/>
-    <w:tmpl w:val="88E0A3AC"/>
-    <w:lvl w:ilvl="0" w:tplc="6AD62B02" w:tentative="1">
+    <w:tmpl w:val="B8E846F4"/>
+    <w:lvl w:ilvl="0" w:tplc="9502D37A">
       <w:start w:val="1"/>
-      <w:numFmt w:val="bullet"/>
-      <w:lvlText w:val="●"/>
+      <w:numFmt w:val="decimal"/>
+      <w:lvlText w:val="%1."/>
       <w:lvlJc w:val="left"/>
       <w:pPr>
-        <w:ind w:left="720" w:hanging="360"/>
+        <w:ind w:left="540" w:hanging="300"/>
       </w:pPr>
     </w:lvl>
-    <w:lvl w:ilvl="1" w:tplc="69CC4696" w:tentative="1">
-      <w:start w:val="1"/>
-      <w:numFmt w:val="bullet"/>
-      <w:lvlText w:val="○"/>
+    <w:lvl w:ilvl="1" w:tplc="819A82A0">
+      <w:numFmt w:val="decimal"/>
+      <w:lvlText w:val=""/>
       <w:lvlJc w:val="left"/>
-      <w:pPr>
-        <w:ind w:left="1440" w:hanging="360"/>
-      </w:pPr>
     </w:lvl>
-    <w:lvl w:ilvl="2" w:tplc="7D36148A" w:tentative="1">
-      <w:start w:val="1"/>
-      <w:numFmt w:val="bullet"/>
-      <w:lvlText w:val="■"/>
+    <w:lvl w:ilvl="2" w:tplc="9CC60970">
+      <w:numFmt w:val="decimal"/>
+      <w:lvlText w:val=""/>
       <w:lvlJc w:val="left"/>
-      <w:pPr>
-        <w:ind w:left="2160" w:hanging="360"/>
-      </w:pPr>
     </w:lvl>
-    <w:lvl w:ilvl="3" w:tplc="39584B08" w:tentative="1">
-      <w:start w:val="1"/>
-      <w:numFmt w:val="bullet"/>
-      <w:lvlText w:val="●"/>
+    <w:lvl w:ilvl="3" w:tplc="6BD66B1C">
+      <w:numFmt w:val="decimal"/>
+      <w:lvlText w:val=""/>
       <w:lvlJc w:val="left"/>
-      <w:pPr>
-        <w:ind w:left="2880" w:hanging="360"/>
-      </w:pPr>
     </w:lvl>
-    <w:lvl w:ilvl="4" w:tplc="D65AD54A" w:tentative="1">
-      <w:start w:val="1"/>
-      <w:numFmt w:val="bullet"/>
-      <w:lvlText w:val="○"/>
+    <w:lvl w:ilvl="4" w:tplc="A72CE8F6">
+      <w:numFmt w:val="decimal"/>
+      <w:lvlText w:val=""/>
       <w:lvlJc w:val="left"/>
-      <w:pPr>
-        <w:ind w:left="3600" w:hanging="360"/>
-      </w:pPr>
     </w:lvl>
-    <w:lvl w:ilvl="5" w:tplc="20E6949E" w:tentative="1">
-      <w:start w:val="1"/>
-      <w:numFmt w:val="bullet"/>
-      <w:lvlText w:val="■"/>
+    <w:lvl w:ilvl="5" w:tplc="EB943EFE">
+      <w:numFmt w:val="decimal"/>
+      <w:lvlText w:val=""/>
       <w:lvlJc w:val="left"/>
-      <w:pPr>
-        <w:ind w:left="4320" w:hanging="360"/>
-      </w:pPr>
     </w:lvl>
-    <w:lvl w:ilvl="6" w:tplc="E8D0FA72" w:tentative="1">
-      <w:start w:val="1"/>
-      <w:numFmt w:val="bullet"/>
-      <w:lvlText w:val="●"/>
+    <w:lvl w:ilvl="6" w:tplc="2B3C154E">
+      <w:numFmt w:val="decimal"/>
+      <w:lvlText w:val=""/>
       <w:lvlJc w:val="left"/>
-      <w:pPr>
-        <w:ind w:left="5040" w:hanging="360"/>
-      </w:pPr>
     </w:lvl>
-    <w:lvl w:ilvl="7" w:tplc="A1D4AF56" w:tentative="1">
-      <w:start w:val="1"/>
-      <w:numFmt w:val="bullet"/>
-      <w:lvlText w:val="●"/>
+    <w:lvl w:ilvl="7" w:tplc="B43A863E">
+      <w:numFmt w:val="decimal"/>
+      <w:lvlText w:val=""/>
       <w:lvlJc w:val="left"/>
-      <w:pPr>
-        <w:ind w:left="5760" w:hanging="360"/>
-      </w:pPr>
     </w:lvl>
-    <w:lvl w:ilvl="8" w:tplc="F27AC47E" w:tentative="1">
-      <w:start w:val="1"/>
-      <w:numFmt w:val="bullet"/>
-      <w:lvlText w:val="●"/>
+    <w:lvl w:ilvl="8" w:tplc="9A3EB13E">
+      <w:numFmt w:val="decimal"/>
+      <w:lvlText w:val=""/>
       <w:lvlJc w:val="left"/>
-      <w:pPr>
-        <w:ind w:left="6480" w:hanging="360"/>
-      </w:pPr>
     </w:lvl>
   </w:abstractNum>
-  <w:num w:numId="1" w16cid:durableId="1529954714">
-    <w:abstractNumId w:val="2"/>
+  <w:num w:numId="1" w16cid:durableId="1900940711">
+    <w:abstractNumId w:val="0"/>
     <w:lvlOverride w:ilvl="0">
       <w:startOverride w:val="1"/>
     </w:lvlOverride>
   </w:num>
-  <w:num w:numId="2" w16cid:durableId="1390230025">
+  <w:num w:numId="2" w16cid:durableId="156387321">
     <w:abstractNumId w:val="1"/>
     <w:lvlOverride w:ilvl="0">
       <w:startOverride w:val="1"/>
     </w:lvlOverride>
   </w:num>
-  <w:num w:numId="3" w16cid:durableId="319191534">
-    <w:abstractNumId w:val="0"/>
+  <w:num w:numId="3" w16cid:durableId="744301218">
+    <w:abstractNumId w:val="2"/>
     <w:lvlOverride w:ilvl="0">
       <w:startOverride w:val="1"/>
     </w:lvlOverride>
@@ -6235,7 +7775,7 @@
     <w:autoRedefine/>
     <w:uiPriority w:val="39"/>
     <w:unhideWhenUsed/>
-    <w:rsid w:val="00FE5FF5"/>
+    <w:rsid w:val="00D91566"/>
     <w:pPr>
       <w:spacing w:after="100"/>
     </w:pPr>
@@ -6247,7 +7787,7 @@
     <w:autoRedefine/>
     <w:uiPriority w:val="39"/>
     <w:unhideWhenUsed/>
-    <w:rsid w:val="00FE5FF5"/>
+    <w:rsid w:val="00D91566"/>
     <w:pPr>
       <w:spacing w:after="100"/>
       <w:ind w:left="220"/>

</xml_diff>

<commit_message>
One-click start and https so phones can scan with the camera
- start.bat (Windows) and start.sh (Mac/Linux) install packages and start
  both servers
- Vite serves https with a local certificate, so Android Chrome on the
  same Wi-Fi can use the live barcode scanner
- READMEs and Word documentation: 2-step run guide and phone steps

Co-Authored-By: Claude Opus 5.5 <noreply@anthropic.com>
</commit_message>
<xml_diff>
--- a/deliverables/TruthShift_Documentation.docx
+++ b/deliverables/TruthShift_Documentation.docx
@@ -90,7 +90,7 @@
     <w:sdt>
       <w:sdtPr>
         <w:alias w:val="Contents"/>
-        <w:id w:val="458606944"/>
+        <w:id w:val="-1612587347"/>
       </w:sdtPr>
       <w:sdtEndPr/>
       <w:sdtContent>
@@ -113,7 +113,7 @@
           <w:r>
             <w:fldChar w:fldCharType="separate"/>
           </w:r>
-          <w:hyperlink w:anchor="_Toc242959981" w:history="1">
+          <w:hyperlink w:anchor="_Toc242961211" w:history="1">
             <w:r>
               <w:rPr>
                 <w:rStyle w:val="Hyperlink"/>
@@ -137,7 +137,7 @@
               <w:rPr>
                 <w:noProof/>
               </w:rPr>
-              <w:instrText xml:space="preserve"> PAGEREF _Toc242959981 \h </w:instrText>
+              <w:instrText xml:space="preserve"> PAGEREF _Toc242961211 \h </w:instrText>
             </w:r>
             <w:r>
               <w:rPr>
@@ -174,7 +174,7 @@
               <w:noProof/>
             </w:rPr>
           </w:pPr>
-          <w:hyperlink w:anchor="_Toc242959982" w:history="1">
+          <w:hyperlink w:anchor="_Toc242961212" w:history="1">
             <w:r>
               <w:rPr>
                 <w:rStyle w:val="Hyperlink"/>
@@ -198,7 +198,7 @@
               <w:rPr>
                 <w:noProof/>
               </w:rPr>
-              <w:instrText xml:space="preserve"> PAGEREF _Toc242959982 \h </w:instrText>
+              <w:instrText xml:space="preserve"> PAGEREF _Toc242961212 \h </w:instrText>
             </w:r>
             <w:r>
               <w:rPr>
@@ -235,7 +235,7 @@
               <w:noProof/>
             </w:rPr>
           </w:pPr>
-          <w:hyperlink w:anchor="_Toc242959983" w:history="1">
+          <w:hyperlink w:anchor="_Toc242961213" w:history="1">
             <w:r>
               <w:rPr>
                 <w:rStyle w:val="Hyperlink"/>
@@ -259,7 +259,7 @@
               <w:rPr>
                 <w:noProof/>
               </w:rPr>
-              <w:instrText xml:space="preserve"> PAGEREF _Toc242959983 \h </w:instrText>
+              <w:instrText xml:space="preserve"> PAGEREF _Toc242961213 \h </w:instrText>
             </w:r>
             <w:r>
               <w:rPr>
@@ -296,7 +296,7 @@
               <w:noProof/>
             </w:rPr>
           </w:pPr>
-          <w:hyperlink w:anchor="_Toc242959984" w:history="1">
+          <w:hyperlink w:anchor="_Toc242961214" w:history="1">
             <w:r>
               <w:rPr>
                 <w:rStyle w:val="Hyperlink"/>
@@ -320,7 +320,7 @@
               <w:rPr>
                 <w:noProof/>
               </w:rPr>
-              <w:instrText xml:space="preserve"> PAGEREF _Toc242959984 \h </w:instrText>
+              <w:instrText xml:space="preserve"> PAGEREF _Toc242961214 \h </w:instrText>
             </w:r>
             <w:r>
               <w:rPr>
@@ -357,7 +357,7 @@
               <w:noProof/>
             </w:rPr>
           </w:pPr>
-          <w:hyperlink w:anchor="_Toc242959985" w:history="1">
+          <w:hyperlink w:anchor="_Toc242961215" w:history="1">
             <w:r>
               <w:rPr>
                 <w:rStyle w:val="Hyperlink"/>
@@ -381,7 +381,7 @@
               <w:rPr>
                 <w:noProof/>
               </w:rPr>
-              <w:instrText xml:space="preserve"> PAGEREF _Toc242959985 \h </w:instrText>
+              <w:instrText xml:space="preserve"> PAGEREF _Toc242961215 \h </w:instrText>
             </w:r>
             <w:r>
               <w:rPr>
@@ -418,7 +418,7 @@
               <w:noProof/>
             </w:rPr>
           </w:pPr>
-          <w:hyperlink w:anchor="_Toc242959986" w:history="1">
+          <w:hyperlink w:anchor="_Toc242961216" w:history="1">
             <w:r>
               <w:rPr>
                 <w:rStyle w:val="Hyperlink"/>
@@ -442,7 +442,7 @@
               <w:rPr>
                 <w:noProof/>
               </w:rPr>
-              <w:instrText xml:space="preserve"> PAGEREF _Toc242959986 \h </w:instrText>
+              <w:instrText xml:space="preserve"> PAGEREF _Toc242961216 \h </w:instrText>
             </w:r>
             <w:r>
               <w:rPr>
@@ -479,7 +479,7 @@
               <w:noProof/>
             </w:rPr>
           </w:pPr>
-          <w:hyperlink w:anchor="_Toc242959987" w:history="1">
+          <w:hyperlink w:anchor="_Toc242961217" w:history="1">
             <w:r>
               <w:rPr>
                 <w:rStyle w:val="Hyperlink"/>
@@ -503,7 +503,7 @@
               <w:rPr>
                 <w:noProof/>
               </w:rPr>
-              <w:instrText xml:space="preserve"> PAGEREF _Toc242959987 \h </w:instrText>
+              <w:instrText xml:space="preserve"> PAGEREF _Toc242961217 \h </w:instrText>
             </w:r>
             <w:r>
               <w:rPr>
@@ -540,7 +540,7 @@
               <w:noProof/>
             </w:rPr>
           </w:pPr>
-          <w:hyperlink w:anchor="_Toc242959988" w:history="1">
+          <w:hyperlink w:anchor="_Toc242961218" w:history="1">
             <w:r>
               <w:rPr>
                 <w:rStyle w:val="Hyperlink"/>
@@ -564,7 +564,7 @@
               <w:rPr>
                 <w:noProof/>
               </w:rPr>
-              <w:instrText xml:space="preserve"> PAGEREF _Toc242959988 \h </w:instrText>
+              <w:instrText xml:space="preserve"> PAGEREF _Toc242961218 \h </w:instrText>
             </w:r>
             <w:r>
               <w:rPr>
@@ -601,13 +601,13 @@
               <w:noProof/>
             </w:rPr>
           </w:pPr>
-          <w:hyperlink w:anchor="_Toc242959989" w:history="1">
+          <w:hyperlink w:anchor="_Toc242961219" w:history="1">
             <w:r>
               <w:rPr>
                 <w:rStyle w:val="Hyperlink"/>
                 <w:noProof/>
               </w:rPr>
-              <w:t>Frontend (app on http://localhost:5173)</w:t>
+              <w:t>Frontend (app on https://localhost:5173)</w:t>
             </w:r>
             <w:r>
               <w:rPr>
@@ -625,7 +625,7 @@
               <w:rPr>
                 <w:noProof/>
               </w:rPr>
-              <w:instrText xml:space="preserve"> PAGEREF _Toc242959989 \h </w:instrText>
+              <w:instrText xml:space="preserve"> PAGEREF _Toc242961219 \h </w:instrText>
             </w:r>
             <w:r>
               <w:rPr>
@@ -662,7 +662,7 @@
               <w:noProof/>
             </w:rPr>
           </w:pPr>
-          <w:hyperlink w:anchor="_Toc242959990" w:history="1">
+          <w:hyperlink w:anchor="_Toc242961220" w:history="1">
             <w:r>
               <w:rPr>
                 <w:rStyle w:val="Hyperlink"/>
@@ -686,7 +686,7 @@
               <w:rPr>
                 <w:noProof/>
               </w:rPr>
-              <w:instrText xml:space="preserve"> PAGEREF _Toc242959990 \h </w:instrText>
+              <w:instrText xml:space="preserve"> PAGEREF _Toc242961220 \h </w:instrText>
             </w:r>
             <w:r>
               <w:rPr>
@@ -723,7 +723,7 @@
               <w:noProof/>
             </w:rPr>
           </w:pPr>
-          <w:hyperlink w:anchor="_Toc242959991" w:history="1">
+          <w:hyperlink w:anchor="_Toc242961221" w:history="1">
             <w:r>
               <w:rPr>
                 <w:rStyle w:val="Hyperlink"/>
@@ -747,7 +747,7 @@
               <w:rPr>
                 <w:noProof/>
               </w:rPr>
-              <w:instrText xml:space="preserve"> PAGEREF _Toc242959991 \h </w:instrText>
+              <w:instrText xml:space="preserve"> PAGEREF _Toc242961221 \h </w:instrText>
             </w:r>
             <w:r>
               <w:rPr>
@@ -784,7 +784,7 @@
               <w:noProof/>
             </w:rPr>
           </w:pPr>
-          <w:hyperlink w:anchor="_Toc242959992" w:history="1">
+          <w:hyperlink w:anchor="_Toc242961222" w:history="1">
             <w:r>
               <w:rPr>
                 <w:rStyle w:val="Hyperlink"/>
@@ -808,7 +808,7 @@
               <w:rPr>
                 <w:noProof/>
               </w:rPr>
-              <w:instrText xml:space="preserve"> PAGEREF _Toc242959992 \h </w:instrText>
+              <w:instrText xml:space="preserve"> PAGEREF _Toc242961222 \h </w:instrText>
             </w:r>
             <w:r>
               <w:rPr>
@@ -845,7 +845,7 @@
               <w:noProof/>
             </w:rPr>
           </w:pPr>
-          <w:hyperlink w:anchor="_Toc242959993" w:history="1">
+          <w:hyperlink w:anchor="_Toc242961223" w:history="1">
             <w:r>
               <w:rPr>
                 <w:rStyle w:val="Hyperlink"/>
@@ -869,7 +869,7 @@
               <w:rPr>
                 <w:noProof/>
               </w:rPr>
-              <w:instrText xml:space="preserve"> PAGEREF _Toc242959993 \h </w:instrText>
+              <w:instrText xml:space="preserve"> PAGEREF _Toc242961223 \h </w:instrText>
             </w:r>
             <w:r>
               <w:rPr>
@@ -906,7 +906,7 @@
               <w:noProof/>
             </w:rPr>
           </w:pPr>
-          <w:hyperlink w:anchor="_Toc242959994" w:history="1">
+          <w:hyperlink w:anchor="_Toc242961224" w:history="1">
             <w:r>
               <w:rPr>
                 <w:rStyle w:val="Hyperlink"/>
@@ -930,7 +930,7 @@
               <w:rPr>
                 <w:noProof/>
               </w:rPr>
-              <w:instrText xml:space="preserve"> PAGEREF _Toc242959994 \h </w:instrText>
+              <w:instrText xml:space="preserve"> PAGEREF _Toc242961224 \h </w:instrText>
             </w:r>
             <w:r>
               <w:rPr>
@@ -967,7 +967,7 @@
               <w:noProof/>
             </w:rPr>
           </w:pPr>
-          <w:hyperlink w:anchor="_Toc242959995" w:history="1">
+          <w:hyperlink w:anchor="_Toc242961225" w:history="1">
             <w:r>
               <w:rPr>
                 <w:rStyle w:val="Hyperlink"/>
@@ -991,7 +991,7 @@
               <w:rPr>
                 <w:noProof/>
               </w:rPr>
-              <w:instrText xml:space="preserve"> PAGEREF _Toc242959995 \h </w:instrText>
+              <w:instrText xml:space="preserve"> PAGEREF _Toc242961225 \h </w:instrText>
             </w:r>
             <w:r>
               <w:rPr>
@@ -1035,7 +1035,7 @@
         <w:pStyle w:val="Heading1"/>
         <w:keepNext/>
       </w:pPr>
-      <w:bookmarkStart w:id="0" w:name="_Toc242959981"/>
+      <w:bookmarkStart w:id="0" w:name="_Toc242961211"/>
       <w:r>
         <w:t>1. Overview</w:t>
       </w:r>
@@ -1084,7 +1084,7 @@
         <w:pStyle w:val="Heading1"/>
         <w:keepNext/>
       </w:pPr>
-      <w:bookmarkStart w:id="1" w:name="_Toc242959982"/>
+      <w:bookmarkStart w:id="1" w:name="_Toc242961212"/>
       <w:r>
         <w:t>2. Features</w:t>
       </w:r>
@@ -1644,7 +1644,7 @@
         <w:pStyle w:val="Heading1"/>
         <w:keepNext/>
       </w:pPr>
-      <w:bookmarkStart w:id="2" w:name="_Toc242959983"/>
+      <w:bookmarkStart w:id="2" w:name="_Toc242961213"/>
       <w:r>
         <w:t>3. Tech stack</w:t>
       </w:r>
@@ -2333,7 +2333,7 @@
         <w:pStyle w:val="Heading1"/>
         <w:keepNext/>
       </w:pPr>
-      <w:bookmarkStart w:id="3" w:name="_Toc242959984"/>
+      <w:bookmarkStart w:id="3" w:name="_Toc242961214"/>
       <w:r>
         <w:t>4. Architecture</w:t>
       </w:r>
@@ -2357,7 +2357,7 @@
           <w:noProof/>
         </w:rPr>
         <w:drawing>
-          <wp:inline distT="0" distB="0" distL="0" distR="0" wp14:anchorId="6FDD9E59" wp14:editId="2410A04A">
+          <wp:inline distT="0" distB="0" distL="0" distR="0" wp14:anchorId="3483F0BF" wp14:editId="44B7A16F">
             <wp:extent cx="5715000" cy="3133725"/>
             <wp:effectExtent l="0" t="0" r="0" b="0"/>
             <wp:docPr id="1" name="Architecture diagram: React frontend calls the FastAPI backend, which reads the JSON dataset and calls Open Food Facts and the Claude API; map tiles load from OpenStreetMap into the browser" descr="Architecture diagram: React frontend calls the FastAPI backend, which reads the JSON dataset and calls Open Food Facts and the Claude API; map tiles load from OpenStreetMap into the browser" title="Architecture diagram: React frontend calls the FastAPI backend, which reads the JSON dataset and calls Open Food Facts and the Claude API; map tiles load from OpenStreetMap into the browser"/>
@@ -3024,7 +3024,7 @@
         <w:pStyle w:val="Heading1"/>
         <w:keepNext/>
       </w:pPr>
-      <w:bookmarkStart w:id="4" w:name="_Toc242959985"/>
+      <w:bookmarkStart w:id="4" w:name="_Toc242961215"/>
       <w:r>
         <w:t>5. Scoring method</w:t>
       </w:r>
@@ -3602,7 +3602,7 @@
         <w:pStyle w:val="Heading1"/>
         <w:keepNext/>
       </w:pPr>
-      <w:bookmarkStart w:id="5" w:name="_Toc242959986"/>
+      <w:bookmarkStart w:id="5" w:name="_Toc242961216"/>
       <w:r>
         <w:t>6. Datasets</w:t>
       </w:r>
@@ -4502,7 +4502,7 @@
           <w:noProof/>
         </w:rPr>
         <w:drawing>
-          <wp:inline distT="0" distB="0" distL="0" distR="0" wp14:anchorId="2CE1F659" wp14:editId="73B48866">
+          <wp:inline distT="0" distB="0" distL="0" distR="0" wp14:anchorId="53B8F531" wp14:editId="79A338C8">
             <wp:extent cx="5715000" cy="3057525"/>
             <wp:effectExtent l="0" t="0" r="0" b="0"/>
             <wp:docPr id="2" name="Bar chart: share of products with a known fact by factor. Demo products: Buy Canadian 89%, fair trade 50%, animal welfare 73%, environment 65%, packaging 100%. Real products: 6%, 0%, 8%, 85%, 3%" descr="Bar chart: share of products with a known fact by factor. Demo products: Buy Canadian 89%, fair trade 50%, animal welfare 73%, environment 65%, packaging 100%. Real products: 6%, 0%, 8%, 85%, 3%" title="Bar chart: share of products with a known fact by factor. Demo products: Buy Canadian 89%, fair trade 50%, animal welfare 73%, environment 65%, packaging 100%. Real products: 6%, 0%, 8%, 85%, 3%"/>
@@ -4578,7 +4578,7 @@
         <w:pStyle w:val="Heading1"/>
         <w:keepNext/>
       </w:pPr>
-      <w:bookmarkStart w:id="6" w:name="_Toc242959987"/>
+      <w:bookmarkStart w:id="6" w:name="_Toc242961217"/>
       <w:r>
         <w:t>7. How to run and customize</w:t>
       </w:r>
@@ -4589,7 +4589,36 @@
         <w:spacing w:after="140"/>
       </w:pPr>
       <w:r>
-        <w:t>You need two terminals: one for the backend and one for the frontend. Python 3.10+ and Node.js 20+ are required.</w:t>
+        <w:rPr>
+          <w:b/>
+          <w:bCs/>
+        </w:rPr>
+        <w:t>Easiest way:</w:t>
+      </w:r>
+      <w:r>
+        <w:t xml:space="preserve"> double-click </w:t>
+      </w:r>
+      <w:r>
+        <w:rPr>
+          <w:rFonts w:ascii="Consolas" w:eastAsia="Consolas" w:hAnsi="Consolas" w:cs="Consolas"/>
+          <w:sz w:val="20"/>
+          <w:szCs w:val="20"/>
+        </w:rPr>
+        <w:t>truthshift/start.bat</w:t>
+      </w:r>
+      <w:r>
+        <w:t xml:space="preserve"> on Windows (or run </w:t>
+      </w:r>
+      <w:r>
+        <w:rPr>
+          <w:rFonts w:ascii="Consolas" w:eastAsia="Consolas" w:hAnsi="Consolas" w:cs="Consolas"/>
+          <w:sz w:val="20"/>
+          <w:szCs w:val="20"/>
+        </w:rPr>
+        <w:t>./start.sh</w:t>
+      </w:r>
+      <w:r>
+        <w:t xml:space="preserve"> on Mac/Linux). It installs packages the first time and starts both servers. Python 3.10+ and Node.js 20+ are required. To start them by hand, use two terminals:</w:t>
       </w:r>
     </w:p>
     <w:p>
@@ -4597,7 +4626,7 @@
         <w:pStyle w:val="Heading2"/>
         <w:keepNext/>
       </w:pPr>
-      <w:bookmarkStart w:id="7" w:name="_Toc242959988"/>
+      <w:bookmarkStart w:id="7" w:name="_Toc242961218"/>
       <w:r>
         <w:t>Backend (API on http://localhost:8000, docs at /docs)</w:t>
       </w:r>
@@ -4651,9 +4680,9 @@
         <w:pStyle w:val="Heading2"/>
         <w:keepNext/>
       </w:pPr>
-      <w:bookmarkStart w:id="8" w:name="_Toc242959989"/>
-      <w:r>
-        <w:t>Frontend (app on http://localhost:5173)</w:t>
+      <w:bookmarkStart w:id="8" w:name="_Toc242961219"/>
+      <w:r>
+        <w:t>Frontend (app on https://localhost:5173)</w:t>
       </w:r>
       <w:bookmarkEnd w:id="8"/>
     </w:p>
@@ -5328,7 +5357,25 @@
         <w:spacing w:after="140"/>
       </w:pPr>
       <w:r>
-        <w:t>To test on a phone, run both servers on the laptop and open the laptop’s network address on port 5173 (Vite prints it). The phone camera needs https, so on a phone use the photo upload or type the barcode.</w:t>
+        <w:rPr>
+          <w:b/>
+          <w:bCs/>
+        </w:rPr>
+        <w:t>On an Android phone:</w:t>
+      </w:r>
+      <w:r>
+        <w:t xml:space="preserve"> connect the phone to the same Wi-Fi, open the </w:t>
+      </w:r>
+      <w:r>
+        <w:rPr>
+          <w:rFonts w:ascii="Consolas" w:eastAsia="Consolas" w:hAnsi="Consolas" w:cs="Consolas"/>
+          <w:sz w:val="20"/>
+          <w:szCs w:val="20"/>
+        </w:rPr>
+        <w:t>Network: https://…:5173</w:t>
+      </w:r>
+      <w:r>
+        <w:t xml:space="preserve"> address that Vite prints in Chrome, tap Advanced → Proceed on the certificate warning, and allow the camera. The app is served over https with a local certificate, so live barcode scanning works. Chrome menu → Add to Home screen gives a TruthShift app icon.</w:t>
       </w:r>
     </w:p>
     <w:p>
@@ -5336,7 +5383,7 @@
         <w:pStyle w:val="Heading1"/>
         <w:keepNext/>
       </w:pPr>
-      <w:bookmarkStart w:id="9" w:name="_Toc242959990"/>
+      <w:bookmarkStart w:id="9" w:name="_Toc242961220"/>
       <w:r>
         <w:t>8. Business model and running costs</w:t>
       </w:r>
@@ -5365,7 +5412,7 @@
         <w:pStyle w:val="Heading2"/>
         <w:keepNext/>
       </w:pPr>
-      <w:bookmarkStart w:id="10" w:name="_Toc242959991"/>
+      <w:bookmarkStart w:id="10" w:name="_Toc242961221"/>
       <w:r>
         <w:t>How it is paid for</w:t>
       </w:r>
@@ -5697,7 +5744,7 @@
         <w:pStyle w:val="Heading2"/>
         <w:keepNext/>
       </w:pPr>
-      <w:bookmarkStart w:id="11" w:name="_Toc242959992"/>
+      <w:bookmarkStart w:id="11" w:name="_Toc242961222"/>
       <w:r>
         <w:t>Free vs Plus (proposal)</w:t>
       </w:r>
@@ -5992,7 +6039,7 @@
         <w:pStyle w:val="Heading2"/>
         <w:keepNext/>
       </w:pPr>
-      <w:bookmarkStart w:id="12" w:name="_Toc242959993"/>
+      <w:bookmarkStart w:id="12" w:name="_Toc242961223"/>
       <w:r>
         <w:t>Running costs (USD per month, October 2026)</w:t>
       </w:r>
@@ -6621,7 +6668,7 @@
         <w:pStyle w:val="Heading1"/>
         <w:keepNext/>
       </w:pPr>
-      <w:bookmarkStart w:id="13" w:name="_Toc242959994"/>
+      <w:bookmarkStart w:id="13" w:name="_Toc242961224"/>
       <w:r>
         <w:t>9. Limitations and future work</w:t>
       </w:r>
@@ -6740,7 +6787,7 @@
         <w:pStyle w:val="Heading2"/>
         <w:keepNext/>
       </w:pPr>
-      <w:bookmarkStart w:id="14" w:name="_Toc242959995"/>
+      <w:bookmarkStart w:id="14" w:name="_Toc242961225"/>
       <w:r>
         <w:t>Next steps</w:t>
       </w:r>
@@ -6922,96 +6969,10 @@
 <file path=word/numbering.xml><?xml version="1.0" encoding="utf-8"?>
 <w:numbering xmlns:wpc="http://schemas.microsoft.com/office/word/2010/wordprocessingCanvas" xmlns:cx="http://schemas.microsoft.com/office/drawing/2014/chartex" xmlns:cx1="http://schemas.microsoft.com/office/drawing/2015/9/8/chartex" xmlns:cx2="http://schemas.microsoft.com/office/drawing/2015/10/21/chartex" xmlns:cx3="http://schemas.microsoft.com/office/drawing/2016/5/9/chartex" xmlns:cx4="http://schemas.microsoft.com/office/drawing/2016/5/10/chartex" xmlns:cx5="http://schemas.microsoft.com/office/drawing/2016/5/11/chartex" xmlns:cx6="http://schemas.microsoft.com/office/drawing/2016/5/12/chartex" xmlns:cx7="http://schemas.microsoft.com/office/drawing/2016/5/13/chartex" xmlns:cx8="http://schemas.microsoft.com/office/drawing/2016/5/14/chartex" xmlns:mc="http://schemas.openxmlformats.org/markup-compatibility/2006" xmlns:aink="http://schemas.microsoft.com/office/drawing/2016/ink" xmlns:am3d="http://schemas.microsoft.com/office/drawing/2017/model3d" xmlns:o="urn:schemas-microsoft-com:office:office" xmlns:oel="http://schemas.microsoft.com/office/2019/extlst" xmlns:r="http://schemas.openxmlformats.org/officeDocument/2006/relationships" xmlns:m="http://schemas.openxmlformats.org/officeDocument/2006/math" xmlns:v="urn:schemas-microsoft-com:vml" xmlns:wp14="http://schemas.microsoft.com/office/word/2010/wordprocessingDrawing" xmlns:wp="http://schemas.openxmlformats.org/drawingml/2006/wordprocessingDrawing" xmlns:w10="urn:schemas-microsoft-com:office:word" xmlns:w="http://schemas.openxmlformats.org/wordprocessingml/2006/main" xmlns:w14="http://schemas.microsoft.com/office/word/2010/wordml" xmlns:w15="http://schemas.microsoft.com/office/word/2012/wordml" xmlns:w16cex="http://schemas.microsoft.com/office/word/2018/wordml/cex" xmlns:w16cid="http://schemas.microsoft.com/office/word/2016/wordml/cid" xmlns:w16="http://schemas.microsoft.com/office/word/2018/wordml" xmlns:w16du="http://schemas.microsoft.com/office/word/2023/wordml/word16du" xmlns:w16sdtdh="http://schemas.microsoft.com/office/word/2020/wordml/sdtdatahash" xmlns:w16sdtfl="http://schemas.microsoft.com/office/word/2024/wordml/sdtformatlock" xmlns:w16se="http://schemas.microsoft.com/office/word/2015/wordml/symex" xmlns:wpg="http://schemas.microsoft.com/office/word/2010/wordprocessingGroup" xmlns:wpi="http://schemas.microsoft.com/office/word/2010/wordprocessingInk" xmlns:wne="http://schemas.microsoft.com/office/word/2006/wordml" xmlns:wps="http://schemas.microsoft.com/office/word/2010/wordprocessingShape" mc:Ignorable="w14 w15 w16se w16cid w16 w16cex w16sdtdh w16sdtfl w16du wp14">
   <w:abstractNum w:abstractNumId="0" w15:restartNumberingAfterBreak="0">
-    <w:nsid w:val="019A3085"/>
+    <w:nsid w:val="0CC634E5"/>
     <w:multiLevelType w:val="hybridMultilevel"/>
-    <w:tmpl w:val="7A384B5C"/>
-    <w:lvl w:ilvl="0" w:tplc="8188A38E" w:tentative="1">
-      <w:start w:val="1"/>
-      <w:numFmt w:val="bullet"/>
-      <w:lvlText w:val="●"/>
-      <w:lvlJc w:val="left"/>
-      <w:pPr>
-        <w:ind w:left="720" w:hanging="360"/>
-      </w:pPr>
-    </w:lvl>
-    <w:lvl w:ilvl="1" w:tplc="235CE10C" w:tentative="1">
-      <w:start w:val="1"/>
-      <w:numFmt w:val="bullet"/>
-      <w:lvlText w:val="○"/>
-      <w:lvlJc w:val="left"/>
-      <w:pPr>
-        <w:ind w:left="1440" w:hanging="360"/>
-      </w:pPr>
-    </w:lvl>
-    <w:lvl w:ilvl="2" w:tplc="4260EF0E" w:tentative="1">
-      <w:start w:val="1"/>
-      <w:numFmt w:val="bullet"/>
-      <w:lvlText w:val="■"/>
-      <w:lvlJc w:val="left"/>
-      <w:pPr>
-        <w:ind w:left="2160" w:hanging="360"/>
-      </w:pPr>
-    </w:lvl>
-    <w:lvl w:ilvl="3" w:tplc="85044B6C" w:tentative="1">
-      <w:start w:val="1"/>
-      <w:numFmt w:val="bullet"/>
-      <w:lvlText w:val="●"/>
-      <w:lvlJc w:val="left"/>
-      <w:pPr>
-        <w:ind w:left="2880" w:hanging="360"/>
-      </w:pPr>
-    </w:lvl>
-    <w:lvl w:ilvl="4" w:tplc="FF10B4B6" w:tentative="1">
-      <w:start w:val="1"/>
-      <w:numFmt w:val="bullet"/>
-      <w:lvlText w:val="○"/>
-      <w:lvlJc w:val="left"/>
-      <w:pPr>
-        <w:ind w:left="3600" w:hanging="360"/>
-      </w:pPr>
-    </w:lvl>
-    <w:lvl w:ilvl="5" w:tplc="34F02FF8" w:tentative="1">
-      <w:start w:val="1"/>
-      <w:numFmt w:val="bullet"/>
-      <w:lvlText w:val="■"/>
-      <w:lvlJc w:val="left"/>
-      <w:pPr>
-        <w:ind w:left="4320" w:hanging="360"/>
-      </w:pPr>
-    </w:lvl>
-    <w:lvl w:ilvl="6" w:tplc="BE54376C" w:tentative="1">
-      <w:start w:val="1"/>
-      <w:numFmt w:val="bullet"/>
-      <w:lvlText w:val="●"/>
-      <w:lvlJc w:val="left"/>
-      <w:pPr>
-        <w:ind w:left="5040" w:hanging="360"/>
-      </w:pPr>
-    </w:lvl>
-    <w:lvl w:ilvl="7" w:tplc="A912C728" w:tentative="1">
-      <w:start w:val="1"/>
-      <w:numFmt w:val="bullet"/>
-      <w:lvlText w:val="●"/>
-      <w:lvlJc w:val="left"/>
-      <w:pPr>
-        <w:ind w:left="5760" w:hanging="360"/>
-      </w:pPr>
-    </w:lvl>
-    <w:lvl w:ilvl="8" w:tplc="D500054A" w:tentative="1">
-      <w:start w:val="1"/>
-      <w:numFmt w:val="bullet"/>
-      <w:lvlText w:val="●"/>
-      <w:lvlJc w:val="left"/>
-      <w:pPr>
-        <w:ind w:left="6480" w:hanging="360"/>
-      </w:pPr>
-    </w:lvl>
-  </w:abstractNum>
-  <w:abstractNum w:abstractNumId="1" w15:restartNumberingAfterBreak="0">
-    <w:nsid w:val="369B114B"/>
-    <w:multiLevelType w:val="hybridMultilevel"/>
-    <w:tmpl w:val="491C45D4"/>
-    <w:lvl w:ilvl="0" w:tplc="5F104C2E">
+    <w:tmpl w:val="EC74D9AC"/>
+    <w:lvl w:ilvl="0" w:tplc="173A7D6E">
       <w:start w:val="1"/>
       <w:numFmt w:val="bullet"/>
       <w:lvlText w:val="•"/>
@@ -7020,52 +6981,138 @@
         <w:ind w:left="540" w:hanging="270"/>
       </w:pPr>
     </w:lvl>
-    <w:lvl w:ilvl="1" w:tplc="CFEAE412">
+    <w:lvl w:ilvl="1" w:tplc="7B8E6794">
       <w:numFmt w:val="decimal"/>
       <w:lvlText w:val=""/>
       <w:lvlJc w:val="left"/>
     </w:lvl>
-    <w:lvl w:ilvl="2" w:tplc="07EA0B44">
+    <w:lvl w:ilvl="2" w:tplc="26B2F0C4">
       <w:numFmt w:val="decimal"/>
       <w:lvlText w:val=""/>
       <w:lvlJc w:val="left"/>
     </w:lvl>
-    <w:lvl w:ilvl="3" w:tplc="8B388408">
+    <w:lvl w:ilvl="3" w:tplc="57BC2116">
       <w:numFmt w:val="decimal"/>
       <w:lvlText w:val=""/>
       <w:lvlJc w:val="left"/>
     </w:lvl>
-    <w:lvl w:ilvl="4" w:tplc="AD7261D4">
+    <w:lvl w:ilvl="4" w:tplc="AD88CE38">
       <w:numFmt w:val="decimal"/>
       <w:lvlText w:val=""/>
       <w:lvlJc w:val="left"/>
     </w:lvl>
-    <w:lvl w:ilvl="5" w:tplc="727A439E">
+    <w:lvl w:ilvl="5" w:tplc="AEDA9580">
       <w:numFmt w:val="decimal"/>
       <w:lvlText w:val=""/>
       <w:lvlJc w:val="left"/>
     </w:lvl>
-    <w:lvl w:ilvl="6" w:tplc="60F61652">
+    <w:lvl w:ilvl="6" w:tplc="CA825356">
       <w:numFmt w:val="decimal"/>
       <w:lvlText w:val=""/>
       <w:lvlJc w:val="left"/>
     </w:lvl>
-    <w:lvl w:ilvl="7" w:tplc="AE22C69C">
+    <w:lvl w:ilvl="7" w:tplc="8E887C16">
       <w:numFmt w:val="decimal"/>
       <w:lvlText w:val=""/>
       <w:lvlJc w:val="left"/>
     </w:lvl>
-    <w:lvl w:ilvl="8" w:tplc="09600FF6">
+    <w:lvl w:ilvl="8" w:tplc="D7AA0FAA">
       <w:numFmt w:val="decimal"/>
       <w:lvlText w:val=""/>
       <w:lvlJc w:val="left"/>
     </w:lvl>
   </w:abstractNum>
+  <w:abstractNum w:abstractNumId="1" w15:restartNumberingAfterBreak="0">
+    <w:nsid w:val="1BD85C68"/>
+    <w:multiLevelType w:val="hybridMultilevel"/>
+    <w:tmpl w:val="182E2330"/>
+    <w:lvl w:ilvl="0" w:tplc="6ED8D88C" w:tentative="1">
+      <w:start w:val="1"/>
+      <w:numFmt w:val="bullet"/>
+      <w:lvlText w:val="●"/>
+      <w:lvlJc w:val="left"/>
+      <w:pPr>
+        <w:ind w:left="720" w:hanging="360"/>
+      </w:pPr>
+    </w:lvl>
+    <w:lvl w:ilvl="1" w:tplc="0728D94C" w:tentative="1">
+      <w:start w:val="1"/>
+      <w:numFmt w:val="bullet"/>
+      <w:lvlText w:val="○"/>
+      <w:lvlJc w:val="left"/>
+      <w:pPr>
+        <w:ind w:left="1440" w:hanging="360"/>
+      </w:pPr>
+    </w:lvl>
+    <w:lvl w:ilvl="2" w:tplc="D52A2870" w:tentative="1">
+      <w:start w:val="1"/>
+      <w:numFmt w:val="bullet"/>
+      <w:lvlText w:val="■"/>
+      <w:lvlJc w:val="left"/>
+      <w:pPr>
+        <w:ind w:left="2160" w:hanging="360"/>
+      </w:pPr>
+    </w:lvl>
+    <w:lvl w:ilvl="3" w:tplc="AA065C42" w:tentative="1">
+      <w:start w:val="1"/>
+      <w:numFmt w:val="bullet"/>
+      <w:lvlText w:val="●"/>
+      <w:lvlJc w:val="left"/>
+      <w:pPr>
+        <w:ind w:left="2880" w:hanging="360"/>
+      </w:pPr>
+    </w:lvl>
+    <w:lvl w:ilvl="4" w:tplc="DF72CF3C" w:tentative="1">
+      <w:start w:val="1"/>
+      <w:numFmt w:val="bullet"/>
+      <w:lvlText w:val="○"/>
+      <w:lvlJc w:val="left"/>
+      <w:pPr>
+        <w:ind w:left="3600" w:hanging="360"/>
+      </w:pPr>
+    </w:lvl>
+    <w:lvl w:ilvl="5" w:tplc="D4BCBE1E" w:tentative="1">
+      <w:start w:val="1"/>
+      <w:numFmt w:val="bullet"/>
+      <w:lvlText w:val="■"/>
+      <w:lvlJc w:val="left"/>
+      <w:pPr>
+        <w:ind w:left="4320" w:hanging="360"/>
+      </w:pPr>
+    </w:lvl>
+    <w:lvl w:ilvl="6" w:tplc="FDD8DE20" w:tentative="1">
+      <w:start w:val="1"/>
+      <w:numFmt w:val="bullet"/>
+      <w:lvlText w:val="●"/>
+      <w:lvlJc w:val="left"/>
+      <w:pPr>
+        <w:ind w:left="5040" w:hanging="360"/>
+      </w:pPr>
+    </w:lvl>
+    <w:lvl w:ilvl="7" w:tplc="208AB978" w:tentative="1">
+      <w:start w:val="1"/>
+      <w:numFmt w:val="bullet"/>
+      <w:lvlText w:val="●"/>
+      <w:lvlJc w:val="left"/>
+      <w:pPr>
+        <w:ind w:left="5760" w:hanging="360"/>
+      </w:pPr>
+    </w:lvl>
+    <w:lvl w:ilvl="8" w:tplc="BCEC18B0" w:tentative="1">
+      <w:start w:val="1"/>
+      <w:numFmt w:val="bullet"/>
+      <w:lvlText w:val="●"/>
+      <w:lvlJc w:val="left"/>
+      <w:pPr>
+        <w:ind w:left="6480" w:hanging="360"/>
+      </w:pPr>
+    </w:lvl>
+  </w:abstractNum>
   <w:abstractNum w:abstractNumId="2" w15:restartNumberingAfterBreak="0">
-    <w:nsid w:val="51D35EFD"/>
+    <w:nsid w:val="5AC86E41"/>
     <w:multiLevelType w:val="hybridMultilevel"/>
-    <w:tmpl w:val="B8E846F4"/>
-    <w:lvl w:ilvl="0" w:tplc="9502D37A">
+    <w:tmpl w:val="F4F28C22"/>
+    <w:lvl w:ilvl="0" w:tplc="6B8C35EC">
       <w:start w:val="1"/>
       <w:numFmt w:val="decimal"/>
       <w:lvlText w:val="%1."/>
@@ -7074,60 +7121,60 @@
         <w:ind w:left="540" w:hanging="300"/>
       </w:pPr>
     </w:lvl>
-    <w:lvl w:ilvl="1" w:tplc="819A82A0">
+    <w:lvl w:ilvl="1" w:tplc="FC68C9E8">
       <w:numFmt w:val="decimal"/>
       <w:lvlText w:val=""/>
       <w:lvlJc w:val="left"/>
     </w:lvl>
-    <w:lvl w:ilvl="2" w:tplc="9CC60970">
+    <w:lvl w:ilvl="2" w:tplc="695E93F8">
       <w:numFmt w:val="decimal"/>
       <w:lvlText w:val=""/>
       <w:lvlJc w:val="left"/>
     </w:lvl>
-    <w:lvl w:ilvl="3" w:tplc="6BD66B1C">
+    <w:lvl w:ilvl="3" w:tplc="125467D6">
       <w:numFmt w:val="decimal"/>
       <w:lvlText w:val=""/>
       <w:lvlJc w:val="left"/>
     </w:lvl>
-    <w:lvl w:ilvl="4" w:tplc="A72CE8F6">
+    <w:lvl w:ilvl="4" w:tplc="0596841C">
       <w:numFmt w:val="decimal"/>
       <w:lvlText w:val=""/>
       <w:lvlJc w:val="left"/>
     </w:lvl>
-    <w:lvl w:ilvl="5" w:tplc="EB943EFE">
+    <w:lvl w:ilvl="5" w:tplc="AC0A8BB6">
       <w:numFmt w:val="decimal"/>
       <w:lvlText w:val=""/>
       <w:lvlJc w:val="left"/>
     </w:lvl>
-    <w:lvl w:ilvl="6" w:tplc="2B3C154E">
+    <w:lvl w:ilvl="6" w:tplc="6F8CE09E">
       <w:numFmt w:val="decimal"/>
       <w:lvlText w:val=""/>
       <w:lvlJc w:val="left"/>
     </w:lvl>
-    <w:lvl w:ilvl="7" w:tplc="B43A863E">
+    <w:lvl w:ilvl="7" w:tplc="BCF45220">
       <w:numFmt w:val="decimal"/>
       <w:lvlText w:val=""/>
       <w:lvlJc w:val="left"/>
     </w:lvl>
-    <w:lvl w:ilvl="8" w:tplc="9A3EB13E">
+    <w:lvl w:ilvl="8" w:tplc="046859CC">
       <w:numFmt w:val="decimal"/>
       <w:lvlText w:val=""/>
       <w:lvlJc w:val="left"/>
     </w:lvl>
   </w:abstractNum>
-  <w:num w:numId="1" w16cid:durableId="1900940711">
+  <w:num w:numId="1" w16cid:durableId="1940217464">
+    <w:abstractNumId w:val="1"/>
+    <w:lvlOverride w:ilvl="0">
+      <w:startOverride w:val="1"/>
+    </w:lvlOverride>
+  </w:num>
+  <w:num w:numId="2" w16cid:durableId="620306012">
     <w:abstractNumId w:val="0"/>
     <w:lvlOverride w:ilvl="0">
       <w:startOverride w:val="1"/>
     </w:lvlOverride>
   </w:num>
-  <w:num w:numId="2" w16cid:durableId="156387321">
-    <w:abstractNumId w:val="1"/>
-    <w:lvlOverride w:ilvl="0">
-      <w:startOverride w:val="1"/>
-    </w:lvlOverride>
-  </w:num>
-  <w:num w:numId="3" w16cid:durableId="744301218">
+  <w:num w:numId="3" w16cid:durableId="2026594912">
     <w:abstractNumId w:val="2"/>
     <w:lvlOverride w:ilvl="0">
       <w:startOverride w:val="1"/>
@@ -7775,7 +7822,7 @@
     <w:autoRedefine/>
     <w:uiPriority w:val="39"/>
     <w:unhideWhenUsed/>
-    <w:rsid w:val="00D91566"/>
+    <w:rsid w:val="00D6686A"/>
     <w:pPr>
       <w:spacing w:after="100"/>
     </w:pPr>
@@ -7787,7 +7834,7 @@
     <w:autoRedefine/>
     <w:uiPriority w:val="39"/>
     <w:unhideWhenUsed/>
-    <w:rsid w:val="00D91566"/>
+    <w:rsid w:val="00D6686A"/>
     <w:pPr>
       <w:spacing w:after="100"/>
       <w:ind w:left="220"/>

</xml_diff>

<commit_message>
Keep English and French only; remove Gujarati
App language menu, AI answer languages, prototype, presentation,
documentation and READMEs now cover English and French.

Co-Authored-By: Claude Opus 5.5 <noreply@anthropic.com>
</commit_message>
<xml_diff>
--- a/deliverables/TruthShift_Documentation.docx
+++ b/deliverables/TruthShift_Documentation.docx
@@ -90,7 +90,7 @@
     <w:sdt>
       <w:sdtPr>
         <w:alias w:val="Contents"/>
-        <w:id w:val="-1612587347"/>
+        <w:id w:val="-172110509"/>
       </w:sdtPr>
       <w:sdtEndPr/>
       <w:sdtContent>
@@ -113,7 +113,7 @@
           <w:r>
             <w:fldChar w:fldCharType="separate"/>
           </w:r>
-          <w:hyperlink w:anchor="_Toc242961211" w:history="1">
+          <w:hyperlink w:anchor="_Toc242962283" w:history="1">
             <w:r>
               <w:rPr>
                 <w:rStyle w:val="Hyperlink"/>
@@ -137,7 +137,7 @@
               <w:rPr>
                 <w:noProof/>
               </w:rPr>
-              <w:instrText xml:space="preserve"> PAGEREF _Toc242961211 \h </w:instrText>
+              <w:instrText xml:space="preserve"> PAGEREF _Toc242962283 \h </w:instrText>
             </w:r>
             <w:r>
               <w:rPr>
@@ -174,7 +174,7 @@
               <w:noProof/>
             </w:rPr>
           </w:pPr>
-          <w:hyperlink w:anchor="_Toc242961212" w:history="1">
+          <w:hyperlink w:anchor="_Toc242962284" w:history="1">
             <w:r>
               <w:rPr>
                 <w:rStyle w:val="Hyperlink"/>
@@ -198,7 +198,7 @@
               <w:rPr>
                 <w:noProof/>
               </w:rPr>
-              <w:instrText xml:space="preserve"> PAGEREF _Toc242961212 \h </w:instrText>
+              <w:instrText xml:space="preserve"> PAGEREF _Toc242962284 \h </w:instrText>
             </w:r>
             <w:r>
               <w:rPr>
@@ -235,7 +235,7 @@
               <w:noProof/>
             </w:rPr>
           </w:pPr>
-          <w:hyperlink w:anchor="_Toc242961213" w:history="1">
+          <w:hyperlink w:anchor="_Toc242962285" w:history="1">
             <w:r>
               <w:rPr>
                 <w:rStyle w:val="Hyperlink"/>
@@ -259,7 +259,7 @@
               <w:rPr>
                 <w:noProof/>
               </w:rPr>
-              <w:instrText xml:space="preserve"> PAGEREF _Toc242961213 \h </w:instrText>
+              <w:instrText xml:space="preserve"> PAGEREF _Toc242962285 \h </w:instrText>
             </w:r>
             <w:r>
               <w:rPr>
@@ -296,7 +296,7 @@
               <w:noProof/>
             </w:rPr>
           </w:pPr>
-          <w:hyperlink w:anchor="_Toc242961214" w:history="1">
+          <w:hyperlink w:anchor="_Toc242962286" w:history="1">
             <w:r>
               <w:rPr>
                 <w:rStyle w:val="Hyperlink"/>
@@ -320,7 +320,7 @@
               <w:rPr>
                 <w:noProof/>
               </w:rPr>
-              <w:instrText xml:space="preserve"> PAGEREF _Toc242961214 \h </w:instrText>
+              <w:instrText xml:space="preserve"> PAGEREF _Toc242962286 \h </w:instrText>
             </w:r>
             <w:r>
               <w:rPr>
@@ -357,7 +357,7 @@
               <w:noProof/>
             </w:rPr>
           </w:pPr>
-          <w:hyperlink w:anchor="_Toc242961215" w:history="1">
+          <w:hyperlink w:anchor="_Toc242962287" w:history="1">
             <w:r>
               <w:rPr>
                 <w:rStyle w:val="Hyperlink"/>
@@ -381,7 +381,7 @@
               <w:rPr>
                 <w:noProof/>
               </w:rPr>
-              <w:instrText xml:space="preserve"> PAGEREF _Toc242961215 \h </w:instrText>
+              <w:instrText xml:space="preserve"> PAGEREF _Toc242962287 \h </w:instrText>
             </w:r>
             <w:r>
               <w:rPr>
@@ -418,7 +418,7 @@
               <w:noProof/>
             </w:rPr>
           </w:pPr>
-          <w:hyperlink w:anchor="_Toc242961216" w:history="1">
+          <w:hyperlink w:anchor="_Toc242962288" w:history="1">
             <w:r>
               <w:rPr>
                 <w:rStyle w:val="Hyperlink"/>
@@ -442,7 +442,7 @@
               <w:rPr>
                 <w:noProof/>
               </w:rPr>
-              <w:instrText xml:space="preserve"> PAGEREF _Toc242961216 \h </w:instrText>
+              <w:instrText xml:space="preserve"> PAGEREF _Toc242962288 \h </w:instrText>
             </w:r>
             <w:r>
               <w:rPr>
@@ -479,7 +479,7 @@
               <w:noProof/>
             </w:rPr>
           </w:pPr>
-          <w:hyperlink w:anchor="_Toc242961217" w:history="1">
+          <w:hyperlink w:anchor="_Toc242962289" w:history="1">
             <w:r>
               <w:rPr>
                 <w:rStyle w:val="Hyperlink"/>
@@ -503,7 +503,7 @@
               <w:rPr>
                 <w:noProof/>
               </w:rPr>
-              <w:instrText xml:space="preserve"> PAGEREF _Toc242961217 \h </w:instrText>
+              <w:instrText xml:space="preserve"> PAGEREF _Toc242962289 \h </w:instrText>
             </w:r>
             <w:r>
               <w:rPr>
@@ -540,7 +540,7 @@
               <w:noProof/>
             </w:rPr>
           </w:pPr>
-          <w:hyperlink w:anchor="_Toc242961218" w:history="1">
+          <w:hyperlink w:anchor="_Toc242962290" w:history="1">
             <w:r>
               <w:rPr>
                 <w:rStyle w:val="Hyperlink"/>
@@ -564,7 +564,7 @@
               <w:rPr>
                 <w:noProof/>
               </w:rPr>
-              <w:instrText xml:space="preserve"> PAGEREF _Toc242961218 \h </w:instrText>
+              <w:instrText xml:space="preserve"> PAGEREF _Toc242962290 \h </w:instrText>
             </w:r>
             <w:r>
               <w:rPr>
@@ -601,7 +601,7 @@
               <w:noProof/>
             </w:rPr>
           </w:pPr>
-          <w:hyperlink w:anchor="_Toc242961219" w:history="1">
+          <w:hyperlink w:anchor="_Toc242962291" w:history="1">
             <w:r>
               <w:rPr>
                 <w:rStyle w:val="Hyperlink"/>
@@ -625,7 +625,7 @@
               <w:rPr>
                 <w:noProof/>
               </w:rPr>
-              <w:instrText xml:space="preserve"> PAGEREF _Toc242961219 \h </w:instrText>
+              <w:instrText xml:space="preserve"> PAGEREF _Toc242962291 \h </w:instrText>
             </w:r>
             <w:r>
               <w:rPr>
@@ -662,7 +662,7 @@
               <w:noProof/>
             </w:rPr>
           </w:pPr>
-          <w:hyperlink w:anchor="_Toc242961220" w:history="1">
+          <w:hyperlink w:anchor="_Toc242962292" w:history="1">
             <w:r>
               <w:rPr>
                 <w:rStyle w:val="Hyperlink"/>
@@ -686,7 +686,7 @@
               <w:rPr>
                 <w:noProof/>
               </w:rPr>
-              <w:instrText xml:space="preserve"> PAGEREF _Toc242961220 \h </w:instrText>
+              <w:instrText xml:space="preserve"> PAGEREF _Toc242962292 \h </w:instrText>
             </w:r>
             <w:r>
               <w:rPr>
@@ -723,7 +723,7 @@
               <w:noProof/>
             </w:rPr>
           </w:pPr>
-          <w:hyperlink w:anchor="_Toc242961221" w:history="1">
+          <w:hyperlink w:anchor="_Toc242962293" w:history="1">
             <w:r>
               <w:rPr>
                 <w:rStyle w:val="Hyperlink"/>
@@ -747,7 +747,7 @@
               <w:rPr>
                 <w:noProof/>
               </w:rPr>
-              <w:instrText xml:space="preserve"> PAGEREF _Toc242961221 \h </w:instrText>
+              <w:instrText xml:space="preserve"> PAGEREF _Toc242962293 \h </w:instrText>
             </w:r>
             <w:r>
               <w:rPr>
@@ -784,7 +784,7 @@
               <w:noProof/>
             </w:rPr>
           </w:pPr>
-          <w:hyperlink w:anchor="_Toc242961222" w:history="1">
+          <w:hyperlink w:anchor="_Toc242962294" w:history="1">
             <w:r>
               <w:rPr>
                 <w:rStyle w:val="Hyperlink"/>
@@ -808,7 +808,7 @@
               <w:rPr>
                 <w:noProof/>
               </w:rPr>
-              <w:instrText xml:space="preserve"> PAGEREF _Toc242961222 \h </w:instrText>
+              <w:instrText xml:space="preserve"> PAGEREF _Toc242962294 \h </w:instrText>
             </w:r>
             <w:r>
               <w:rPr>
@@ -845,7 +845,7 @@
               <w:noProof/>
             </w:rPr>
           </w:pPr>
-          <w:hyperlink w:anchor="_Toc242961223" w:history="1">
+          <w:hyperlink w:anchor="_Toc242962295" w:history="1">
             <w:r>
               <w:rPr>
                 <w:rStyle w:val="Hyperlink"/>
@@ -869,7 +869,7 @@
               <w:rPr>
                 <w:noProof/>
               </w:rPr>
-              <w:instrText xml:space="preserve"> PAGEREF _Toc242961223 \h </w:instrText>
+              <w:instrText xml:space="preserve"> PAGEREF _Toc242962295 \h </w:instrText>
             </w:r>
             <w:r>
               <w:rPr>
@@ -906,7 +906,7 @@
               <w:noProof/>
             </w:rPr>
           </w:pPr>
-          <w:hyperlink w:anchor="_Toc242961224" w:history="1">
+          <w:hyperlink w:anchor="_Toc242962296" w:history="1">
             <w:r>
               <w:rPr>
                 <w:rStyle w:val="Hyperlink"/>
@@ -930,7 +930,7 @@
               <w:rPr>
                 <w:noProof/>
               </w:rPr>
-              <w:instrText xml:space="preserve"> PAGEREF _Toc242961224 \h </w:instrText>
+              <w:instrText xml:space="preserve"> PAGEREF _Toc242962296 \h </w:instrText>
             </w:r>
             <w:r>
               <w:rPr>
@@ -967,7 +967,7 @@
               <w:noProof/>
             </w:rPr>
           </w:pPr>
-          <w:hyperlink w:anchor="_Toc242961225" w:history="1">
+          <w:hyperlink w:anchor="_Toc242962297" w:history="1">
             <w:r>
               <w:rPr>
                 <w:rStyle w:val="Hyperlink"/>
@@ -991,7 +991,7 @@
               <w:rPr>
                 <w:noProof/>
               </w:rPr>
-              <w:instrText xml:space="preserve"> PAGEREF _Toc242961225 \h </w:instrText>
+              <w:instrText xml:space="preserve"> PAGEREF _Toc242962297 \h </w:instrText>
             </w:r>
             <w:r>
               <w:rPr>
@@ -1035,7 +1035,7 @@
         <w:pStyle w:val="Heading1"/>
         <w:keepNext/>
       </w:pPr>
-      <w:bookmarkStart w:id="0" w:name="_Toc242961211"/>
+      <w:bookmarkStart w:id="0" w:name="_Toc242962283"/>
       <w:r>
         <w:t>1. Overview</w:t>
       </w:r>
@@ -1076,7 +1076,7 @@
         <w:t>Our solution.</w:t>
       </w:r>
       <w:r>
-        <w:t xml:space="preserve"> The shopper sets how much each issue matters to them. They scan or search a product and get a personal score from 0 to 100, a plain-language explanation, and better alternatives at a similar price in nearby stores. Every fact carries an evidence label: Verified, Claimed by the business, or Unknown. Unknown facts never count against a product; they lower a separate confidence meter instead. The app is built for newcomers to Regina, with English, French and Gujarati screens and local recycling guidance.</w:t>
+        <w:t xml:space="preserve"> The shopper sets how much each issue matters to them. They scan or search a product and get a personal score from 0 to 100, a plain-language explanation, and better alternatives at a similar price in nearby stores. Every fact carries an evidence label: Verified, Claimed by the business, or Unknown. Unknown facts never count against a product; they lower a separate confidence meter instead. The app is built for newcomers to Regina, with English and French screens and local recycling guidance.</w:t>
       </w:r>
     </w:p>
     <w:p>
@@ -1084,7 +1084,7 @@
         <w:pStyle w:val="Heading1"/>
         <w:keepNext/>
       </w:pPr>
-      <w:bookmarkStart w:id="1" w:name="_Toc242961212"/>
+      <w:bookmarkStart w:id="1" w:name="_Toc242962284"/>
       <w:r>
         <w:t>2. Features</w:t>
       </w:r>
@@ -1461,7 +1461,7 @@
           </w:tcPr>
           <w:p>
             <w:r>
-              <w:t>Asks in plain words (“Canadian, no plastic, under $5”) and gets a ranked list, plus a written answer from Claude in English, French or Gujarati</w:t>
+              <w:t>Asks in plain words (“Canadian, no plastic, under $5”) and gets a ranked list, plus a written answer from Claude in English or French</w:t>
             </w:r>
           </w:p>
         </w:tc>
@@ -1644,7 +1644,7 @@
         <w:pStyle w:val="Heading1"/>
         <w:keepNext/>
       </w:pPr>
-      <w:bookmarkStart w:id="2" w:name="_Toc242961213"/>
+      <w:bookmarkStart w:id="2" w:name="_Toc242962285"/>
       <w:r>
         <w:t>3. Tech stack</w:t>
       </w:r>
@@ -2183,7 +2183,7 @@
           </w:tcPr>
           <w:p>
             <w:r>
-              <w:t>Writes plain-language answers in English, French or Gujarati using only our data. Optional: runs only when an API key is set</w:t>
+              <w:t>Writes plain-language answers in English or French using only our data. Optional: runs only when an API key is set</w:t>
             </w:r>
           </w:p>
         </w:tc>
@@ -2333,7 +2333,7 @@
         <w:pStyle w:val="Heading1"/>
         <w:keepNext/>
       </w:pPr>
-      <w:bookmarkStart w:id="3" w:name="_Toc242961214"/>
+      <w:bookmarkStart w:id="3" w:name="_Toc242962286"/>
       <w:r>
         <w:t>4. Architecture</w:t>
       </w:r>
@@ -2357,7 +2357,7 @@
           <w:noProof/>
         </w:rPr>
         <w:drawing>
-          <wp:inline distT="0" distB="0" distL="0" distR="0" wp14:anchorId="3483F0BF" wp14:editId="44B7A16F">
+          <wp:inline distT="0" distB="0" distL="0" distR="0" wp14:anchorId="5018F6AB" wp14:editId="68BBEC0A">
             <wp:extent cx="5715000" cy="3133725"/>
             <wp:effectExtent l="0" t="0" r="0" b="0"/>
             <wp:docPr id="1" name="Architecture diagram: React frontend calls the FastAPI backend, which reads the JSON dataset and calls Open Food Facts and the Claude API; map tiles load from OpenStreetMap into the browser" descr="Architecture diagram: React frontend calls the FastAPI backend, which reads the JSON dataset and calls Open Food Facts and the Claude API; map tiles load from OpenStreetMap into the browser" title="Architecture diagram: React frontend calls the FastAPI backend, which reads the JSON dataset and calls Open Food Facts and the Claude API; map tiles load from OpenStreetMap into the browser"/>
@@ -3024,7 +3024,7 @@
         <w:pStyle w:val="Heading1"/>
         <w:keepNext/>
       </w:pPr>
-      <w:bookmarkStart w:id="4" w:name="_Toc242961215"/>
+      <w:bookmarkStart w:id="4" w:name="_Toc242962287"/>
       <w:r>
         <w:t>5. Scoring method</w:t>
       </w:r>
@@ -3602,7 +3602,7 @@
         <w:pStyle w:val="Heading1"/>
         <w:keepNext/>
       </w:pPr>
-      <w:bookmarkStart w:id="5" w:name="_Toc242961216"/>
+      <w:bookmarkStart w:id="5" w:name="_Toc242962288"/>
       <w:r>
         <w:t>6. Datasets</w:t>
       </w:r>
@@ -4502,7 +4502,7 @@
           <w:noProof/>
         </w:rPr>
         <w:drawing>
-          <wp:inline distT="0" distB="0" distL="0" distR="0" wp14:anchorId="53B8F531" wp14:editId="79A338C8">
+          <wp:inline distT="0" distB="0" distL="0" distR="0" wp14:anchorId="0C5B2762" wp14:editId="200295B9">
             <wp:extent cx="5715000" cy="3057525"/>
             <wp:effectExtent l="0" t="0" r="0" b="0"/>
             <wp:docPr id="2" name="Bar chart: share of products with a known fact by factor. Demo products: Buy Canadian 89%, fair trade 50%, animal welfare 73%, environment 65%, packaging 100%. Real products: 6%, 0%, 8%, 85%, 3%" descr="Bar chart: share of products with a known fact by factor. Demo products: Buy Canadian 89%, fair trade 50%, animal welfare 73%, environment 65%, packaging 100%. Real products: 6%, 0%, 8%, 85%, 3%" title="Bar chart: share of products with a known fact by factor. Demo products: Buy Canadian 89%, fair trade 50%, animal welfare 73%, environment 65%, packaging 100%. Real products: 6%, 0%, 8%, 85%, 3%"/>
@@ -4578,7 +4578,7 @@
         <w:pStyle w:val="Heading1"/>
         <w:keepNext/>
       </w:pPr>
-      <w:bookmarkStart w:id="6" w:name="_Toc242961217"/>
+      <w:bookmarkStart w:id="6" w:name="_Toc242962289"/>
       <w:r>
         <w:t>7. How to run and customize</w:t>
       </w:r>
@@ -4626,7 +4626,7 @@
         <w:pStyle w:val="Heading2"/>
         <w:keepNext/>
       </w:pPr>
-      <w:bookmarkStart w:id="7" w:name="_Toc242961218"/>
+      <w:bookmarkStart w:id="7" w:name="_Toc242962290"/>
       <w:r>
         <w:t>Backend (API on http://localhost:8000, docs at /docs)</w:t>
       </w:r>
@@ -4680,7 +4680,7 @@
         <w:pStyle w:val="Heading2"/>
         <w:keepNext/>
       </w:pPr>
-      <w:bookmarkStart w:id="8" w:name="_Toc242961219"/>
+      <w:bookmarkStart w:id="8" w:name="_Toc242962291"/>
       <w:r>
         <w:t>Frontend (app on https://localhost:5173)</w:t>
       </w:r>
@@ -5383,7 +5383,7 @@
         <w:pStyle w:val="Heading1"/>
         <w:keepNext/>
       </w:pPr>
-      <w:bookmarkStart w:id="9" w:name="_Toc242961220"/>
+      <w:bookmarkStart w:id="9" w:name="_Toc242962292"/>
       <w:r>
         <w:t>8. Business model and running costs</w:t>
       </w:r>
@@ -5412,7 +5412,7 @@
         <w:pStyle w:val="Heading2"/>
         <w:keepNext/>
       </w:pPr>
-      <w:bookmarkStart w:id="10" w:name="_Toc242961221"/>
+      <w:bookmarkStart w:id="10" w:name="_Toc242962293"/>
       <w:r>
         <w:t>How it is paid for</w:t>
       </w:r>
@@ -5744,7 +5744,7 @@
         <w:pStyle w:val="Heading2"/>
         <w:keepNext/>
       </w:pPr>
-      <w:bookmarkStart w:id="11" w:name="_Toc242961222"/>
+      <w:bookmarkStart w:id="11" w:name="_Toc242962294"/>
       <w:r>
         <w:t>Free vs Plus (proposal)</w:t>
       </w:r>
@@ -6039,7 +6039,7 @@
         <w:pStyle w:val="Heading2"/>
         <w:keepNext/>
       </w:pPr>
-      <w:bookmarkStart w:id="12" w:name="_Toc242961223"/>
+      <w:bookmarkStart w:id="12" w:name="_Toc242962295"/>
       <w:r>
         <w:t>Running costs (USD per month, October 2026)</w:t>
       </w:r>
@@ -6668,7 +6668,7 @@
         <w:pStyle w:val="Heading1"/>
         <w:keepNext/>
       </w:pPr>
-      <w:bookmarkStart w:id="13" w:name="_Toc242961224"/>
+      <w:bookmarkStart w:id="13" w:name="_Toc242962296"/>
       <w:r>
         <w:t>9. Limitations and future work</w:t>
       </w:r>
@@ -6787,7 +6787,7 @@
         <w:pStyle w:val="Heading2"/>
         <w:keepNext/>
       </w:pPr>
-      <w:bookmarkStart w:id="14" w:name="_Toc242961225"/>
+      <w:bookmarkStart w:id="14" w:name="_Toc242962297"/>
       <w:r>
         <w:t>Next steps</w:t>
       </w:r>
@@ -6969,10 +6969,96 @@
 <file path=word/numbering.xml><?xml version="1.0" encoding="utf-8"?>
 <w:numbering xmlns:wpc="http://schemas.microsoft.com/office/word/2010/wordprocessingCanvas" xmlns:cx="http://schemas.microsoft.com/office/drawing/2014/chartex" xmlns:cx1="http://schemas.microsoft.com/office/drawing/2015/9/8/chartex" xmlns:cx2="http://schemas.microsoft.com/office/drawing/2015/10/21/chartex" xmlns:cx3="http://schemas.microsoft.com/office/drawing/2016/5/9/chartex" xmlns:cx4="http://schemas.microsoft.com/office/drawing/2016/5/10/chartex" xmlns:cx5="http://schemas.microsoft.com/office/drawing/2016/5/11/chartex" xmlns:cx6="http://schemas.microsoft.com/office/drawing/2016/5/12/chartex" xmlns:cx7="http://schemas.microsoft.com/office/drawing/2016/5/13/chartex" xmlns:cx8="http://schemas.microsoft.com/office/drawing/2016/5/14/chartex" xmlns:mc="http://schemas.openxmlformats.org/markup-compatibility/2006" xmlns:aink="http://schemas.microsoft.com/office/drawing/2016/ink" xmlns:am3d="http://schemas.microsoft.com/office/drawing/2017/model3d" xmlns:o="urn:schemas-microsoft-com:office:office" xmlns:oel="http://schemas.microsoft.com/office/2019/extlst" xmlns:r="http://schemas.openxmlformats.org/officeDocument/2006/relationships" xmlns:m="http://schemas.openxmlformats.org/officeDocument/2006/math" xmlns:v="urn:schemas-microsoft-com:vml" xmlns:wp14="http://schemas.microsoft.com/office/word/2010/wordprocessingDrawing" xmlns:wp="http://schemas.openxmlformats.org/drawingml/2006/wordprocessingDrawing" xmlns:w10="urn:schemas-microsoft-com:office:word" xmlns:w="http://schemas.openxmlformats.org/wordprocessingml/2006/main" xmlns:w14="http://schemas.microsoft.com/office/word/2010/wordml" xmlns:w15="http://schemas.microsoft.com/office/word/2012/wordml" xmlns:w16cex="http://schemas.microsoft.com/office/word/2018/wordml/cex" xmlns:w16cid="http://schemas.microsoft.com/office/word/2016/wordml/cid" xmlns:w16="http://schemas.microsoft.com/office/word/2018/wordml" xmlns:w16du="http://schemas.microsoft.com/office/word/2023/wordml/word16du" xmlns:w16sdtdh="http://schemas.microsoft.com/office/word/2020/wordml/sdtdatahash" xmlns:w16sdtfl="http://schemas.microsoft.com/office/word/2024/wordml/sdtformatlock" xmlns:w16se="http://schemas.microsoft.com/office/word/2015/wordml/symex" xmlns:wpg="http://schemas.microsoft.com/office/word/2010/wordprocessingGroup" xmlns:wpi="http://schemas.microsoft.com/office/word/2010/wordprocessingInk" xmlns:wne="http://schemas.microsoft.com/office/word/2006/wordml" xmlns:wps="http://schemas.microsoft.com/office/word/2010/wordprocessingShape" mc:Ignorable="w14 w15 w16se w16cid w16 w16cex w16sdtdh w16sdtfl w16du wp14">
   <w:abstractNum w:abstractNumId="0" w15:restartNumberingAfterBreak="0">
-    <w:nsid w:val="0CC634E5"/>
+    <w:nsid w:val="27F050BE"/>
     <w:multiLevelType w:val="hybridMultilevel"/>
-    <w:tmpl w:val="EC74D9AC"/>
-    <w:lvl w:ilvl="0" w:tplc="173A7D6E">
+    <w:tmpl w:val="881C319A"/>
+    <w:lvl w:ilvl="0" w:tplc="64AA40A0" w:tentative="1">
+      <w:start w:val="1"/>
+      <w:numFmt w:val="bullet"/>
+      <w:lvlText w:val="●"/>
+      <w:lvlJc w:val="left"/>
+      <w:pPr>
+        <w:ind w:left="720" w:hanging="360"/>
+      </w:pPr>
+    </w:lvl>
+    <w:lvl w:ilvl="1" w:tplc="BB96FF8E" w:tentative="1">
+      <w:start w:val="1"/>
+      <w:numFmt w:val="bullet"/>
+      <w:lvlText w:val="○"/>
+      <w:lvlJc w:val="left"/>
+      <w:pPr>
+        <w:ind w:left="1440" w:hanging="360"/>
+      </w:pPr>
+    </w:lvl>
+    <w:lvl w:ilvl="2" w:tplc="A73063FC" w:tentative="1">
+      <w:start w:val="1"/>
+      <w:numFmt w:val="bullet"/>
+      <w:lvlText w:val="■"/>
+      <w:lvlJc w:val="left"/>
+      <w:pPr>
+        <w:ind w:left="2160" w:hanging="360"/>
+      </w:pPr>
+    </w:lvl>
+    <w:lvl w:ilvl="3" w:tplc="40DCABF2" w:tentative="1">
+      <w:start w:val="1"/>
+      <w:numFmt w:val="bullet"/>
+      <w:lvlText w:val="●"/>
+      <w:lvlJc w:val="left"/>
+      <w:pPr>
+        <w:ind w:left="2880" w:hanging="360"/>
+      </w:pPr>
+    </w:lvl>
+    <w:lvl w:ilvl="4" w:tplc="0FFE0210" w:tentative="1">
+      <w:start w:val="1"/>
+      <w:numFmt w:val="bullet"/>
+      <w:lvlText w:val="○"/>
+      <w:lvlJc w:val="left"/>
+      <w:pPr>
+        <w:ind w:left="3600" w:hanging="360"/>
+      </w:pPr>
+    </w:lvl>
+    <w:lvl w:ilvl="5" w:tplc="8950353E" w:tentative="1">
+      <w:start w:val="1"/>
+      <w:numFmt w:val="bullet"/>
+      <w:lvlText w:val="■"/>
+      <w:lvlJc w:val="left"/>
+      <w:pPr>
+        <w:ind w:left="4320" w:hanging="360"/>
+      </w:pPr>
+    </w:lvl>
+    <w:lvl w:ilvl="6" w:tplc="EB18ABE2" w:tentative="1">
+      <w:start w:val="1"/>
+      <w:numFmt w:val="bullet"/>
+      <w:lvlText w:val="●"/>
+      <w:lvlJc w:val="left"/>
+      <w:pPr>
+        <w:ind w:left="5040" w:hanging="360"/>
+      </w:pPr>
+    </w:lvl>
+    <w:lvl w:ilvl="7" w:tplc="A1F6F6F0" w:tentative="1">
+      <w:start w:val="1"/>
+      <w:numFmt w:val="bullet"/>
+      <w:lvlText w:val="●"/>
+      <w:lvlJc w:val="left"/>
+      <w:pPr>
+        <w:ind w:left="5760" w:hanging="360"/>
+      </w:pPr>
+    </w:lvl>
+    <w:lvl w:ilvl="8" w:tplc="1AE8ADC8" w:tentative="1">
+      <w:start w:val="1"/>
+      <w:numFmt w:val="bullet"/>
+      <w:lvlText w:val="●"/>
+      <w:lvlJc w:val="left"/>
+      <w:pPr>
+        <w:ind w:left="6480" w:hanging="360"/>
+      </w:pPr>
+    </w:lvl>
+  </w:abstractNum>
+  <w:abstractNum w:abstractNumId="1" w15:restartNumberingAfterBreak="0">
+    <w:nsid w:val="5FB01D7F"/>
+    <w:multiLevelType w:val="hybridMultilevel"/>
+    <w:tmpl w:val="835CBE3A"/>
+    <w:lvl w:ilvl="0" w:tplc="6D2A5202">
       <w:start w:val="1"/>
       <w:numFmt w:val="bullet"/>
       <w:lvlText w:val="•"/>
@@ -6981,138 +7067,52 @@
         <w:ind w:left="540" w:hanging="270"/>
       </w:pPr>
     </w:lvl>
-    <w:lvl w:ilvl="1" w:tplc="7B8E6794">
+    <w:lvl w:ilvl="1" w:tplc="738C2FC0">
       <w:numFmt w:val="decimal"/>
       <w:lvlText w:val=""/>
       <w:lvlJc w:val="left"/>
     </w:lvl>
-    <w:lvl w:ilvl="2" w:tplc="26B2F0C4">
+    <w:lvl w:ilvl="2" w:tplc="1E32E1FE">
       <w:numFmt w:val="decimal"/>
       <w:lvlText w:val=""/>
       <w:lvlJc w:val="left"/>
     </w:lvl>
-    <w:lvl w:ilvl="3" w:tplc="57BC2116">
+    <w:lvl w:ilvl="3" w:tplc="8B1E7C96">
       <w:numFmt w:val="decimal"/>
       <w:lvlText w:val=""/>
       <w:lvlJc w:val="left"/>
     </w:lvl>
-    <w:lvl w:ilvl="4" w:tplc="AD88CE38">
+    <w:lvl w:ilvl="4" w:tplc="179AE5B8">
       <w:numFmt w:val="decimal"/>
       <w:lvlText w:val=""/>
       <w:lvlJc w:val="left"/>
     </w:lvl>
-    <w:lvl w:ilvl="5" w:tplc="AEDA9580">
+    <w:lvl w:ilvl="5" w:tplc="533479BE">
       <w:numFmt w:val="decimal"/>
       <w:lvlText w:val=""/>
       <w:lvlJc w:val="left"/>
     </w:lvl>
-    <w:lvl w:ilvl="6" w:tplc="CA825356">
+    <w:lvl w:ilvl="6" w:tplc="FC8414DE">
       <w:numFmt w:val="decimal"/>
       <w:lvlText w:val=""/>
       <w:lvlJc w:val="left"/>
     </w:lvl>
-    <w:lvl w:ilvl="7" w:tplc="8E887C16">
+    <w:lvl w:ilvl="7" w:tplc="CE6816F6">
       <w:numFmt w:val="decimal"/>
       <w:lvlText w:val=""/>
       <w:lvlJc w:val="left"/>
     </w:lvl>
-    <w:lvl w:ilvl="8" w:tplc="D7AA0FAA">
+    <w:lvl w:ilvl="8" w:tplc="2B20F88C">
       <w:numFmt w:val="decimal"/>
       <w:lvlText w:val=""/>
       <w:lvlJc w:val="left"/>
     </w:lvl>
   </w:abstractNum>
-  <w:abstractNum w:abstractNumId="1" w15:restartNumberingAfterBreak="0">
-    <w:nsid w:val="1BD85C68"/>
+  <w:abstractNum w:abstractNumId="2" w15:restartNumberingAfterBreak="0">
+    <w:nsid w:val="729353F7"/>
     <w:multiLevelType w:val="hybridMultilevel"/>
-    <w:tmpl w:val="182E2330"/>
-    <w:lvl w:ilvl="0" w:tplc="6ED8D88C" w:tentative="1">
-      <w:start w:val="1"/>
-      <w:numFmt w:val="bullet"/>
-      <w:lvlText w:val="●"/>
-      <w:lvlJc w:val="left"/>
-      <w:pPr>
-        <w:ind w:left="720" w:hanging="360"/>
-      </w:pPr>
-    </w:lvl>
-    <w:lvl w:ilvl="1" w:tplc="0728D94C" w:tentative="1">
-      <w:start w:val="1"/>
-      <w:numFmt w:val="bullet"/>
-      <w:lvlText w:val="○"/>
-      <w:lvlJc w:val="left"/>
-      <w:pPr>
-        <w:ind w:left="1440" w:hanging="360"/>
-      </w:pPr>
-    </w:lvl>
-    <w:lvl w:ilvl="2" w:tplc="D52A2870" w:tentative="1">
-      <w:start w:val="1"/>
-      <w:numFmt w:val="bullet"/>
-      <w:lvlText w:val="■"/>
-      <w:lvlJc w:val="left"/>
-      <w:pPr>
-        <w:ind w:left="2160" w:hanging="360"/>
-      </w:pPr>
-    </w:lvl>
-    <w:lvl w:ilvl="3" w:tplc="AA065C42" w:tentative="1">
-      <w:start w:val="1"/>
-      <w:numFmt w:val="bullet"/>
-      <w:lvlText w:val="●"/>
-      <w:lvlJc w:val="left"/>
-      <w:pPr>
-        <w:ind w:left="2880" w:hanging="360"/>
-      </w:pPr>
-    </w:lvl>
-    <w:lvl w:ilvl="4" w:tplc="DF72CF3C" w:tentative="1">
-      <w:start w:val="1"/>
-      <w:numFmt w:val="bullet"/>
-      <w:lvlText w:val="○"/>
-      <w:lvlJc w:val="left"/>
-      <w:pPr>
-        <w:ind w:left="3600" w:hanging="360"/>
-      </w:pPr>
-    </w:lvl>
-    <w:lvl w:ilvl="5" w:tplc="D4BCBE1E" w:tentative="1">
-      <w:start w:val="1"/>
-      <w:numFmt w:val="bullet"/>
-      <w:lvlText w:val="■"/>
-      <w:lvlJc w:val="left"/>
-      <w:pPr>
-        <w:ind w:left="4320" w:hanging="360"/>
-      </w:pPr>
-    </w:lvl>
-    <w:lvl w:ilvl="6" w:tplc="FDD8DE20" w:tentative="1">
-      <w:start w:val="1"/>
-      <w:numFmt w:val="bullet"/>
-      <w:lvlText w:val="●"/>
-      <w:lvlJc w:val="left"/>
-      <w:pPr>
-        <w:ind w:left="5040" w:hanging="360"/>
-      </w:pPr>
-    </w:lvl>
-    <w:lvl w:ilvl="7" w:tplc="208AB978" w:tentative="1">
-      <w:start w:val="1"/>
-      <w:numFmt w:val="bullet"/>
-      <w:lvlText w:val="●"/>
-      <w:lvlJc w:val="left"/>
-      <w:pPr>
-        <w:ind w:left="5760" w:hanging="360"/>
-      </w:pPr>
-    </w:lvl>
-    <w:lvl w:ilvl="8" w:tplc="BCEC18B0" w:tentative="1">
-      <w:start w:val="1"/>
-      <w:numFmt w:val="bullet"/>
-      <w:lvlText w:val="●"/>
-      <w:lvlJc w:val="left"/>
-      <w:pPr>
-        <w:ind w:left="6480" w:hanging="360"/>
-      </w:pPr>
-    </w:lvl>
-  </w:abstractNum>
-  <w:abstractNum w:abstractNumId="2" w15:restartNumberingAfterBreak="0">
-    <w:nsid w:val="5AC86E41"/>
-    <w:multiLevelType w:val="hybridMultilevel"/>
-    <w:tmpl w:val="F4F28C22"/>
-    <w:lvl w:ilvl="0" w:tplc="6B8C35EC">
+    <w:tmpl w:val="EDBCF6C8"/>
+    <w:lvl w:ilvl="0" w:tplc="FE4C55DE">
       <w:start w:val="1"/>
       <w:numFmt w:val="decimal"/>
       <w:lvlText w:val="%1."/>
@@ -7121,60 +7121,60 @@
         <w:ind w:left="540" w:hanging="300"/>
       </w:pPr>
     </w:lvl>
-    <w:lvl w:ilvl="1" w:tplc="FC68C9E8">
+    <w:lvl w:ilvl="1" w:tplc="AD762360">
       <w:numFmt w:val="decimal"/>
       <w:lvlText w:val=""/>
       <w:lvlJc w:val="left"/>
     </w:lvl>
-    <w:lvl w:ilvl="2" w:tplc="695E93F8">
+    <w:lvl w:ilvl="2" w:tplc="5B3A218E">
       <w:numFmt w:val="decimal"/>
       <w:lvlText w:val=""/>
       <w:lvlJc w:val="left"/>
     </w:lvl>
-    <w:lvl w:ilvl="3" w:tplc="125467D6">
+    <w:lvl w:ilvl="3" w:tplc="C3D8AFDA">
       <w:numFmt w:val="decimal"/>
       <w:lvlText w:val=""/>
       <w:lvlJc w:val="left"/>
     </w:lvl>
-    <w:lvl w:ilvl="4" w:tplc="0596841C">
+    <w:lvl w:ilvl="4" w:tplc="DC5E9420">
       <w:numFmt w:val="decimal"/>
       <w:lvlText w:val=""/>
       <w:lvlJc w:val="left"/>
     </w:lvl>
-    <w:lvl w:ilvl="5" w:tplc="AC0A8BB6">
+    <w:lvl w:ilvl="5" w:tplc="040EE066">
       <w:numFmt w:val="decimal"/>
       <w:lvlText w:val=""/>
       <w:lvlJc w:val="left"/>
     </w:lvl>
-    <w:lvl w:ilvl="6" w:tplc="6F8CE09E">
+    <w:lvl w:ilvl="6" w:tplc="29309F14">
       <w:numFmt w:val="decimal"/>
       <w:lvlText w:val=""/>
       <w:lvlJc w:val="left"/>
     </w:lvl>
-    <w:lvl w:ilvl="7" w:tplc="BCF45220">
+    <w:lvl w:ilvl="7" w:tplc="4A04E24E">
       <w:numFmt w:val="decimal"/>
       <w:lvlText w:val=""/>
       <w:lvlJc w:val="left"/>
     </w:lvl>
-    <w:lvl w:ilvl="8" w:tplc="046859CC">
+    <w:lvl w:ilvl="8" w:tplc="87C4F548">
       <w:numFmt w:val="decimal"/>
       <w:lvlText w:val=""/>
       <w:lvlJc w:val="left"/>
     </w:lvl>
   </w:abstractNum>
-  <w:num w:numId="1" w16cid:durableId="1940217464">
+  <w:num w:numId="1" w16cid:durableId="2137287654">
+    <w:abstractNumId w:val="0"/>
+    <w:lvlOverride w:ilvl="0">
+      <w:startOverride w:val="1"/>
+    </w:lvlOverride>
+  </w:num>
+  <w:num w:numId="2" w16cid:durableId="1401975882">
     <w:abstractNumId w:val="1"/>
     <w:lvlOverride w:ilvl="0">
       <w:startOverride w:val="1"/>
     </w:lvlOverride>
   </w:num>
-  <w:num w:numId="2" w16cid:durableId="620306012">
-    <w:abstractNumId w:val="0"/>
-    <w:lvlOverride w:ilvl="0">
-      <w:startOverride w:val="1"/>
-    </w:lvlOverride>
-  </w:num>
-  <w:num w:numId="3" w16cid:durableId="2026594912">
+  <w:num w:numId="3" w16cid:durableId="606733799">
     <w:abstractNumId w:val="2"/>
     <w:lvlOverride w:ilvl="0">
       <w:startOverride w:val="1"/>
@@ -7822,7 +7822,7 @@
     <w:autoRedefine/>
     <w:uiPriority w:val="39"/>
     <w:unhideWhenUsed/>
-    <w:rsid w:val="00D6686A"/>
+    <w:rsid w:val="00E049E2"/>
     <w:pPr>
       <w:spacing w:after="100"/>
     </w:pPr>
@@ -7834,7 +7834,7 @@
     <w:autoRedefine/>
     <w:uiPriority w:val="39"/>
     <w:unhideWhenUsed/>
-    <w:rsid w:val="00D6686A"/>
+    <w:rsid w:val="00E049E2"/>
     <w:pPr>
       <w:spacing w:after="100"/>
       <w:ind w:left="220"/>

</xml_diff>